<commit_message>
Added the reassessment trigger criteria functionality.
</commit_message>
<xml_diff>
--- a/deliveries/cases/DE/1.docx
+++ b/deliveries/cases/DE/1.docx
@@ -1,6 +1,6 @@
 
 <file path=word/document.xml><?xml version="1.0" encoding="utf-8"?>
-<w:document xmlns:wpc="http://schemas.microsoft.com/office/word/2010/wordprocessingCanvas" xmlns:cx="http://schemas.microsoft.com/office/drawing/2014/chartex" xmlns:mc="http://schemas.openxmlformats.org/markup-compatibility/2006" xmlns:o="urn:schemas-microsoft-com:office:office" xmlns:r="http://schemas.openxmlformats.org/officeDocument/2006/relationships" xmlns:m="http://schemas.openxmlformats.org/officeDocument/2006/math" xmlns:v="urn:schemas-microsoft-com:vml" xmlns:wp14="http://schemas.microsoft.com/office/word/2010/wordprocessingDrawing" xmlns:wp="http://schemas.openxmlformats.org/drawingml/2006/wordprocessingDrawing" xmlns:w10="urn:schemas-microsoft-com:office:word" xmlns:w="http://schemas.openxmlformats.org/wordprocessingml/2006/main" xmlns:w14="http://schemas.microsoft.com/office/word/2010/wordml" xmlns:w15="http://schemas.microsoft.com/office/word/2012/wordml" xmlns:w16se="http://schemas.microsoft.com/office/word/2015/wordml/symex" xmlns:wpg="http://schemas.microsoft.com/office/word/2010/wordprocessingGroup" xmlns:wpi="http://schemas.microsoft.com/office/word/2010/wordprocessingInk" xmlns:wne="http://schemas.microsoft.com/office/word/2006/wordml" xmlns:wps="http://schemas.microsoft.com/office/word/2010/wordprocessingShape" mc:Ignorable="w14 w15 w16se wp14">
+<w:document xmlns:wpc="http://schemas.microsoft.com/office/word/2010/wordprocessingCanvas" xmlns:cx="http://schemas.microsoft.com/office/drawing/2014/chartex" xmlns:cx1="http://schemas.microsoft.com/office/drawing/2015/9/8/chartex" xmlns:cx2="http://schemas.microsoft.com/office/drawing/2015/10/21/chartex" xmlns:cx3="http://schemas.microsoft.com/office/drawing/2016/5/9/chartex" xmlns:cx4="http://schemas.microsoft.com/office/drawing/2016/5/10/chartex" xmlns:cx5="http://schemas.microsoft.com/office/drawing/2016/5/11/chartex" xmlns:cx6="http://schemas.microsoft.com/office/drawing/2016/5/12/chartex" xmlns:cx7="http://schemas.microsoft.com/office/drawing/2016/5/13/chartex" xmlns:cx8="http://schemas.microsoft.com/office/drawing/2016/5/14/chartex" xmlns:mc="http://schemas.openxmlformats.org/markup-compatibility/2006" xmlns:aink="http://schemas.microsoft.com/office/drawing/2016/ink" xmlns:am3d="http://schemas.microsoft.com/office/drawing/2017/model3d" xmlns:o="urn:schemas-microsoft-com:office:office" xmlns:oel="http://schemas.microsoft.com/office/2019/extlst" xmlns:r="http://schemas.openxmlformats.org/officeDocument/2006/relationships" xmlns:m="http://schemas.openxmlformats.org/officeDocument/2006/math" xmlns:v="urn:schemas-microsoft-com:vml" xmlns:wp14="http://schemas.microsoft.com/office/word/2010/wordprocessingDrawing" xmlns:wp="http://schemas.openxmlformats.org/drawingml/2006/wordprocessingDrawing" xmlns:w10="urn:schemas-microsoft-com:office:word" xmlns:w="http://schemas.openxmlformats.org/wordprocessingml/2006/main" xmlns:w14="http://schemas.microsoft.com/office/word/2010/wordml" xmlns:w15="http://schemas.microsoft.com/office/word/2012/wordml" xmlns:w16cex="http://schemas.microsoft.com/office/word/2018/wordml/cex" xmlns:w16cid="http://schemas.microsoft.com/office/word/2016/wordml/cid" xmlns:w16="http://schemas.microsoft.com/office/word/2018/wordml" xmlns:w16du="http://schemas.microsoft.com/office/word/2023/wordml/word16du" xmlns:w16sdtdh="http://schemas.microsoft.com/office/word/2020/wordml/sdtdatahash" xmlns:w16se="http://schemas.microsoft.com/office/word/2015/wordml/symex" xmlns:wpg="http://schemas.microsoft.com/office/word/2010/wordprocessingGroup" xmlns:wpi="http://schemas.microsoft.com/office/word/2010/wordprocessingInk" xmlns:wne="http://schemas.microsoft.com/office/word/2006/wordml" xmlns:wps="http://schemas.microsoft.com/office/word/2010/wordprocessingShape" mc:Ignorable="w14 w15 w16se w16cid w16 w16cex w16sdtdh w16du wp14">
   <w:body>
     <w:p>
       <w:pPr>
@@ -959,9 +959,11 @@
               <w:bCs w:val="0"/>
               <w:caps w:val="0"/>
               <w:noProof/>
-              <w:sz w:val="22"/>
-              <w:szCs w:val="22"/>
-              <w:lang w:eastAsia="en-US"/>
+              <w:kern w:val="2"/>
+              <w:sz w:val="24"/>
+              <w:szCs w:val="24"/>
+              <w:lang w:val="en-LU" w:eastAsia="en-GB"/>
+              <w14:ligatures w14:val="standardContextual"/>
             </w:rPr>
           </w:pPr>
           <w:r>
@@ -976,7 +978,7 @@
           <w:r>
             <w:fldChar w:fldCharType="separate"/>
           </w:r>
-          <w:hyperlink w:anchor="_Toc75418871" w:history="1">
+          <w:hyperlink w:anchor="_Toc229569526" w:history="1">
             <w:r>
               <w:rPr>
                 <w:rStyle w:val="Hyperlink"/>
@@ -992,9 +994,11 @@
                 <w:bCs w:val="0"/>
                 <w:caps w:val="0"/>
                 <w:noProof/>
-                <w:sz w:val="22"/>
-                <w:szCs w:val="22"/>
-                <w:lang w:eastAsia="en-US"/>
+                <w:kern w:val="2"/>
+                <w:sz w:val="24"/>
+                <w:szCs w:val="24"/>
+                <w:lang w:val="en-LU" w:eastAsia="en-GB"/>
+                <w14:ligatures w14:val="standardContextual"/>
               </w:rPr>
               <w:tab/>
             </w:r>
@@ -1024,7 +1028,7 @@
                 <w:noProof/>
                 <w:webHidden/>
               </w:rPr>
-              <w:instrText xml:space="preserve"> PAGEREF _Toc75418871 \h </w:instrText>
+              <w:instrText xml:space="preserve"> PAGEREF _Toc229569526 \h </w:instrText>
             </w:r>
             <w:r>
               <w:rPr>
@@ -1066,12 +1070,14 @@
               <w:rFonts w:asciiTheme="minorHAnsi" w:eastAsiaTheme="minorEastAsia" w:hAnsiTheme="minorHAnsi" w:cstheme="minorBidi"/>
               <w:smallCaps w:val="0"/>
               <w:noProof/>
-              <w:sz w:val="22"/>
-              <w:szCs w:val="22"/>
-              <w:lang w:eastAsia="en-US"/>
+              <w:kern w:val="2"/>
+              <w:sz w:val="24"/>
+              <w:szCs w:val="24"/>
+              <w:lang w:val="en-LU" w:eastAsia="en-GB"/>
+              <w14:ligatures w14:val="standardContextual"/>
             </w:rPr>
           </w:pPr>
-          <w:hyperlink w:anchor="_Toc75418872" w:history="1">
+          <w:hyperlink w:anchor="_Toc229569527" w:history="1">
             <w:r>
               <w:rPr>
                 <w:rStyle w:val="Hyperlink"/>
@@ -1086,9 +1092,11 @@
                 <w:rFonts w:asciiTheme="minorHAnsi" w:eastAsiaTheme="minorEastAsia" w:hAnsiTheme="minorHAnsi" w:cstheme="minorBidi"/>
                 <w:smallCaps w:val="0"/>
                 <w:noProof/>
-                <w:sz w:val="22"/>
-                <w:szCs w:val="22"/>
-                <w:lang w:eastAsia="en-US"/>
+                <w:kern w:val="2"/>
+                <w:sz w:val="24"/>
+                <w:szCs w:val="24"/>
+                <w:lang w:val="en-LU" w:eastAsia="en-GB"/>
+                <w14:ligatures w14:val="standardContextual"/>
               </w:rPr>
               <w:tab/>
             </w:r>
@@ -1118,7 +1126,7 @@
                 <w:noProof/>
                 <w:webHidden/>
               </w:rPr>
-              <w:instrText xml:space="preserve"> PAGEREF _Toc75418872 \h </w:instrText>
+              <w:instrText xml:space="preserve"> PAGEREF _Toc229569527 \h </w:instrText>
             </w:r>
             <w:r>
               <w:rPr>
@@ -1160,12 +1168,14 @@
               <w:rFonts w:asciiTheme="minorHAnsi" w:eastAsiaTheme="minorEastAsia" w:hAnsiTheme="minorHAnsi" w:cstheme="minorBidi"/>
               <w:smallCaps w:val="0"/>
               <w:noProof/>
-              <w:sz w:val="22"/>
-              <w:szCs w:val="22"/>
-              <w:lang w:eastAsia="en-US"/>
+              <w:kern w:val="2"/>
+              <w:sz w:val="24"/>
+              <w:szCs w:val="24"/>
+              <w:lang w:val="en-LU" w:eastAsia="en-GB"/>
+              <w14:ligatures w14:val="standardContextual"/>
             </w:rPr>
           </w:pPr>
-          <w:hyperlink w:anchor="_Toc75418873" w:history="1">
+          <w:hyperlink w:anchor="_Toc229569528" w:history="1">
             <w:r>
               <w:rPr>
                 <w:rStyle w:val="Hyperlink"/>
@@ -1181,9 +1191,11 @@
                 <w:rFonts w:asciiTheme="minorHAnsi" w:eastAsiaTheme="minorEastAsia" w:hAnsiTheme="minorHAnsi" w:cstheme="minorBidi"/>
                 <w:smallCaps w:val="0"/>
                 <w:noProof/>
-                <w:sz w:val="22"/>
-                <w:szCs w:val="22"/>
-                <w:lang w:eastAsia="en-US"/>
+                <w:kern w:val="2"/>
+                <w:sz w:val="24"/>
+                <w:szCs w:val="24"/>
+                <w:lang w:val="en-LU" w:eastAsia="en-GB"/>
+                <w14:ligatures w14:val="standardContextual"/>
               </w:rPr>
               <w:tab/>
             </w:r>
@@ -1213,7 +1225,7 @@
                 <w:noProof/>
                 <w:webHidden/>
               </w:rPr>
-              <w:instrText xml:space="preserve"> PAGEREF _Toc75418873 \h </w:instrText>
+              <w:instrText xml:space="preserve"> PAGEREF _Toc229569528 \h </w:instrText>
             </w:r>
             <w:r>
               <w:rPr>
@@ -1257,12 +1269,14 @@
               <w:bCs w:val="0"/>
               <w:caps w:val="0"/>
               <w:noProof/>
-              <w:sz w:val="22"/>
-              <w:szCs w:val="22"/>
-              <w:lang w:eastAsia="en-US"/>
+              <w:kern w:val="2"/>
+              <w:sz w:val="24"/>
+              <w:szCs w:val="24"/>
+              <w:lang w:val="en-LU" w:eastAsia="en-GB"/>
+              <w14:ligatures w14:val="standardContextual"/>
             </w:rPr>
           </w:pPr>
-          <w:hyperlink w:anchor="_Toc75418874" w:history="1">
+          <w:hyperlink w:anchor="_Toc229569529" w:history="1">
             <w:r>
               <w:rPr>
                 <w:rStyle w:val="Hyperlink"/>
@@ -1278,9 +1292,11 @@
                 <w:bCs w:val="0"/>
                 <w:caps w:val="0"/>
                 <w:noProof/>
-                <w:sz w:val="22"/>
-                <w:szCs w:val="22"/>
-                <w:lang w:eastAsia="en-US"/>
+                <w:kern w:val="2"/>
+                <w:sz w:val="24"/>
+                <w:szCs w:val="24"/>
+                <w:lang w:val="en-LU" w:eastAsia="en-GB"/>
+                <w14:ligatures w14:val="standardContextual"/>
               </w:rPr>
               <w:tab/>
             </w:r>
@@ -1310,7 +1326,7 @@
                 <w:noProof/>
                 <w:webHidden/>
               </w:rPr>
-              <w:instrText xml:space="preserve"> PAGEREF _Toc75418874 \h </w:instrText>
+              <w:instrText xml:space="preserve"> PAGEREF _Toc229569529 \h </w:instrText>
             </w:r>
             <w:r>
               <w:rPr>
@@ -1352,12 +1368,14 @@
               <w:rFonts w:asciiTheme="minorHAnsi" w:eastAsiaTheme="minorEastAsia" w:hAnsiTheme="minorHAnsi" w:cstheme="minorBidi"/>
               <w:smallCaps w:val="0"/>
               <w:noProof/>
-              <w:sz w:val="22"/>
-              <w:szCs w:val="22"/>
-              <w:lang w:eastAsia="en-US"/>
+              <w:kern w:val="2"/>
+              <w:sz w:val="24"/>
+              <w:szCs w:val="24"/>
+              <w:lang w:val="en-LU" w:eastAsia="en-GB"/>
+              <w14:ligatures w14:val="standardContextual"/>
             </w:rPr>
           </w:pPr>
-          <w:hyperlink w:anchor="_Toc75418875" w:history="1">
+          <w:hyperlink w:anchor="_Toc229569530" w:history="1">
             <w:r>
               <w:rPr>
                 <w:rStyle w:val="Hyperlink"/>
@@ -1373,9 +1391,11 @@
                 <w:rFonts w:asciiTheme="minorHAnsi" w:eastAsiaTheme="minorEastAsia" w:hAnsiTheme="minorHAnsi" w:cstheme="minorBidi"/>
                 <w:smallCaps w:val="0"/>
                 <w:noProof/>
-                <w:sz w:val="22"/>
-                <w:szCs w:val="22"/>
-                <w:lang w:eastAsia="en-US"/>
+                <w:kern w:val="2"/>
+                <w:sz w:val="24"/>
+                <w:szCs w:val="24"/>
+                <w:lang w:val="en-LU" w:eastAsia="en-GB"/>
+                <w14:ligatures w14:val="standardContextual"/>
               </w:rPr>
               <w:tab/>
             </w:r>
@@ -1405,7 +1425,7 @@
                 <w:noProof/>
                 <w:webHidden/>
               </w:rPr>
-              <w:instrText xml:space="preserve"> PAGEREF _Toc75418875 \h </w:instrText>
+              <w:instrText xml:space="preserve"> PAGEREF _Toc229569530 \h </w:instrText>
             </w:r>
             <w:r>
               <w:rPr>
@@ -1447,12 +1467,14 @@
               <w:rFonts w:asciiTheme="minorHAnsi" w:eastAsiaTheme="minorEastAsia" w:hAnsiTheme="minorHAnsi" w:cstheme="minorBidi"/>
               <w:smallCaps w:val="0"/>
               <w:noProof/>
-              <w:sz w:val="22"/>
-              <w:szCs w:val="22"/>
-              <w:lang w:eastAsia="en-US"/>
+              <w:kern w:val="2"/>
+              <w:sz w:val="24"/>
+              <w:szCs w:val="24"/>
+              <w:lang w:val="en-LU" w:eastAsia="en-GB"/>
+              <w14:ligatures w14:val="standardContextual"/>
             </w:rPr>
           </w:pPr>
-          <w:hyperlink w:anchor="_Toc75418876" w:history="1">
+          <w:hyperlink w:anchor="_Toc229569531" w:history="1">
             <w:r>
               <w:rPr>
                 <w:rStyle w:val="Hyperlink"/>
@@ -1467,9 +1489,11 @@
                 <w:rFonts w:asciiTheme="minorHAnsi" w:eastAsiaTheme="minorEastAsia" w:hAnsiTheme="minorHAnsi" w:cstheme="minorBidi"/>
                 <w:smallCaps w:val="0"/>
                 <w:noProof/>
-                <w:sz w:val="22"/>
-                <w:szCs w:val="22"/>
-                <w:lang w:eastAsia="en-US"/>
+                <w:kern w:val="2"/>
+                <w:sz w:val="24"/>
+                <w:szCs w:val="24"/>
+                <w:lang w:val="en-LU" w:eastAsia="en-GB"/>
+                <w14:ligatures w14:val="standardContextual"/>
               </w:rPr>
               <w:tab/>
             </w:r>
@@ -1499,7 +1523,7 @@
                 <w:noProof/>
                 <w:webHidden/>
               </w:rPr>
-              <w:instrText xml:space="preserve"> PAGEREF _Toc75418876 \h </w:instrText>
+              <w:instrText xml:space="preserve"> PAGEREF _Toc229569531 \h </w:instrText>
             </w:r>
             <w:r>
               <w:rPr>
@@ -1542,12 +1566,14 @@
               <w:i w:val="0"/>
               <w:iCs w:val="0"/>
               <w:noProof/>
-              <w:sz w:val="22"/>
-              <w:szCs w:val="22"/>
-              <w:lang w:eastAsia="en-US"/>
+              <w:kern w:val="2"/>
+              <w:sz w:val="24"/>
+              <w:szCs w:val="24"/>
+              <w:lang w:val="en-LU" w:eastAsia="en-GB"/>
+              <w14:ligatures w14:val="standardContextual"/>
             </w:rPr>
           </w:pPr>
-          <w:hyperlink w:anchor="_Toc75418877" w:history="1">
+          <w:hyperlink w:anchor="_Toc229569532" w:history="1">
             <w:r>
               <w:rPr>
                 <w:rStyle w:val="Hyperlink"/>
@@ -1562,9 +1588,11 @@
                 <w:i w:val="0"/>
                 <w:iCs w:val="0"/>
                 <w:noProof/>
-                <w:sz w:val="22"/>
-                <w:szCs w:val="22"/>
-                <w:lang w:eastAsia="en-US"/>
+                <w:kern w:val="2"/>
+                <w:sz w:val="24"/>
+                <w:szCs w:val="24"/>
+                <w:lang w:val="en-LU" w:eastAsia="en-GB"/>
+                <w14:ligatures w14:val="standardContextual"/>
               </w:rPr>
               <w:tab/>
             </w:r>
@@ -1594,7 +1622,7 @@
                 <w:noProof/>
                 <w:webHidden/>
               </w:rPr>
-              <w:instrText xml:space="preserve"> PAGEREF _Toc75418877 \h </w:instrText>
+              <w:instrText xml:space="preserve"> PAGEREF _Toc229569532 \h </w:instrText>
             </w:r>
             <w:r>
               <w:rPr>
@@ -1637,12 +1665,14 @@
               <w:i w:val="0"/>
               <w:iCs w:val="0"/>
               <w:noProof/>
-              <w:sz w:val="22"/>
-              <w:szCs w:val="22"/>
-              <w:lang w:eastAsia="en-US"/>
+              <w:kern w:val="2"/>
+              <w:sz w:val="24"/>
+              <w:szCs w:val="24"/>
+              <w:lang w:val="en-LU" w:eastAsia="en-GB"/>
+              <w14:ligatures w14:val="standardContextual"/>
             </w:rPr>
           </w:pPr>
-          <w:hyperlink w:anchor="_Toc75418878" w:history="1">
+          <w:hyperlink w:anchor="_Toc229569533" w:history="1">
             <w:r>
               <w:rPr>
                 <w:rStyle w:val="Hyperlink"/>
@@ -1657,9 +1687,11 @@
                 <w:i w:val="0"/>
                 <w:iCs w:val="0"/>
                 <w:noProof/>
-                <w:sz w:val="22"/>
-                <w:szCs w:val="22"/>
-                <w:lang w:eastAsia="en-US"/>
+                <w:kern w:val="2"/>
+                <w:sz w:val="24"/>
+                <w:szCs w:val="24"/>
+                <w:lang w:val="en-LU" w:eastAsia="en-GB"/>
+                <w14:ligatures w14:val="standardContextual"/>
               </w:rPr>
               <w:tab/>
             </w:r>
@@ -1689,7 +1721,7 @@
                 <w:noProof/>
                 <w:webHidden/>
               </w:rPr>
-              <w:instrText xml:space="preserve"> PAGEREF _Toc75418878 \h </w:instrText>
+              <w:instrText xml:space="preserve"> PAGEREF _Toc229569533 \h </w:instrText>
             </w:r>
             <w:r>
               <w:rPr>
@@ -1732,12 +1764,14 @@
               <w:i w:val="0"/>
               <w:iCs w:val="0"/>
               <w:noProof/>
-              <w:sz w:val="22"/>
-              <w:szCs w:val="22"/>
-              <w:lang w:eastAsia="en-US"/>
+              <w:kern w:val="2"/>
+              <w:sz w:val="24"/>
+              <w:szCs w:val="24"/>
+              <w:lang w:val="en-LU" w:eastAsia="en-GB"/>
+              <w14:ligatures w14:val="standardContextual"/>
             </w:rPr>
           </w:pPr>
-          <w:hyperlink w:anchor="_Toc75418879" w:history="1">
+          <w:hyperlink w:anchor="_Toc229569534" w:history="1">
             <w:r>
               <w:rPr>
                 <w:rStyle w:val="Hyperlink"/>
@@ -1752,9 +1786,11 @@
                 <w:i w:val="0"/>
                 <w:iCs w:val="0"/>
                 <w:noProof/>
-                <w:sz w:val="22"/>
-                <w:szCs w:val="22"/>
-                <w:lang w:eastAsia="en-US"/>
+                <w:kern w:val="2"/>
+                <w:sz w:val="24"/>
+                <w:szCs w:val="24"/>
+                <w:lang w:val="en-LU" w:eastAsia="en-GB"/>
+                <w14:ligatures w14:val="standardContextual"/>
               </w:rPr>
               <w:tab/>
             </w:r>
@@ -1784,7 +1820,7 @@
                 <w:noProof/>
                 <w:webHidden/>
               </w:rPr>
-              <w:instrText xml:space="preserve"> PAGEREF _Toc75418879 \h </w:instrText>
+              <w:instrText xml:space="preserve"> PAGEREF _Toc229569534 \h </w:instrText>
             </w:r>
             <w:r>
               <w:rPr>
@@ -1827,12 +1863,14 @@
               <w:i w:val="0"/>
               <w:iCs w:val="0"/>
               <w:noProof/>
-              <w:sz w:val="22"/>
-              <w:szCs w:val="22"/>
-              <w:lang w:eastAsia="en-US"/>
+              <w:kern w:val="2"/>
+              <w:sz w:val="24"/>
+              <w:szCs w:val="24"/>
+              <w:lang w:val="en-LU" w:eastAsia="en-GB"/>
+              <w14:ligatures w14:val="standardContextual"/>
             </w:rPr>
           </w:pPr>
-          <w:hyperlink w:anchor="_Toc75418880" w:history="1">
+          <w:hyperlink w:anchor="_Toc229569535" w:history="1">
             <w:r>
               <w:rPr>
                 <w:rStyle w:val="Hyperlink"/>
@@ -1847,9 +1885,11 @@
                 <w:i w:val="0"/>
                 <w:iCs w:val="0"/>
                 <w:noProof/>
-                <w:sz w:val="22"/>
-                <w:szCs w:val="22"/>
-                <w:lang w:eastAsia="en-US"/>
+                <w:kern w:val="2"/>
+                <w:sz w:val="24"/>
+                <w:szCs w:val="24"/>
+                <w:lang w:val="en-LU" w:eastAsia="en-GB"/>
+                <w14:ligatures w14:val="standardContextual"/>
               </w:rPr>
               <w:tab/>
             </w:r>
@@ -1879,7 +1919,7 @@
                 <w:noProof/>
                 <w:webHidden/>
               </w:rPr>
-              <w:instrText xml:space="preserve"> PAGEREF _Toc75418880 \h </w:instrText>
+              <w:instrText xml:space="preserve"> PAGEREF _Toc229569535 \h </w:instrText>
             </w:r>
             <w:r>
               <w:rPr>
@@ -1922,12 +1962,14 @@
               <w:i w:val="0"/>
               <w:iCs w:val="0"/>
               <w:noProof/>
-              <w:sz w:val="22"/>
-              <w:szCs w:val="22"/>
-              <w:lang w:eastAsia="en-US"/>
+              <w:kern w:val="2"/>
+              <w:sz w:val="24"/>
+              <w:szCs w:val="24"/>
+              <w:lang w:val="en-LU" w:eastAsia="en-GB"/>
+              <w14:ligatures w14:val="standardContextual"/>
             </w:rPr>
           </w:pPr>
-          <w:hyperlink w:anchor="_Toc75418881" w:history="1">
+          <w:hyperlink w:anchor="_Toc229569536" w:history="1">
             <w:r>
               <w:rPr>
                 <w:rStyle w:val="Hyperlink"/>
@@ -1942,9 +1984,11 @@
                 <w:i w:val="0"/>
                 <w:iCs w:val="0"/>
                 <w:noProof/>
-                <w:sz w:val="22"/>
-                <w:szCs w:val="22"/>
-                <w:lang w:eastAsia="en-US"/>
+                <w:kern w:val="2"/>
+                <w:sz w:val="24"/>
+                <w:szCs w:val="24"/>
+                <w:lang w:val="en-LU" w:eastAsia="en-GB"/>
+                <w14:ligatures w14:val="standardContextual"/>
               </w:rPr>
               <w:tab/>
             </w:r>
@@ -1974,7 +2018,7 @@
                 <w:noProof/>
                 <w:webHidden/>
               </w:rPr>
-              <w:instrText xml:space="preserve"> PAGEREF _Toc75418881 \h </w:instrText>
+              <w:instrText xml:space="preserve"> PAGEREF _Toc229569536 \h </w:instrText>
             </w:r>
             <w:r>
               <w:rPr>
@@ -2017,12 +2061,14 @@
               <w:i w:val="0"/>
               <w:iCs w:val="0"/>
               <w:noProof/>
-              <w:sz w:val="22"/>
-              <w:szCs w:val="22"/>
-              <w:lang w:eastAsia="en-US"/>
+              <w:kern w:val="2"/>
+              <w:sz w:val="24"/>
+              <w:szCs w:val="24"/>
+              <w:lang w:val="en-LU" w:eastAsia="en-GB"/>
+              <w14:ligatures w14:val="standardContextual"/>
             </w:rPr>
           </w:pPr>
-          <w:hyperlink w:anchor="_Toc75418882" w:history="1">
+          <w:hyperlink w:anchor="_Toc229569537" w:history="1">
             <w:r>
               <w:rPr>
                 <w:rStyle w:val="Hyperlink"/>
@@ -2037,9 +2083,11 @@
                 <w:i w:val="0"/>
                 <w:iCs w:val="0"/>
                 <w:noProof/>
-                <w:sz w:val="22"/>
-                <w:szCs w:val="22"/>
-                <w:lang w:eastAsia="en-US"/>
+                <w:kern w:val="2"/>
+                <w:sz w:val="24"/>
+                <w:szCs w:val="24"/>
+                <w:lang w:val="en-LU" w:eastAsia="en-GB"/>
+                <w14:ligatures w14:val="standardContextual"/>
               </w:rPr>
               <w:tab/>
             </w:r>
@@ -2085,7 +2133,7 @@
                 <w:noProof/>
                 <w:webHidden/>
               </w:rPr>
-              <w:instrText xml:space="preserve"> PAGEREF _Toc75418882 \h </w:instrText>
+              <w:instrText xml:space="preserve"> PAGEREF _Toc229569537 \h </w:instrText>
             </w:r>
             <w:r>
               <w:rPr>
@@ -2128,12 +2176,14 @@
               <w:i w:val="0"/>
               <w:iCs w:val="0"/>
               <w:noProof/>
-              <w:sz w:val="22"/>
-              <w:szCs w:val="22"/>
-              <w:lang w:eastAsia="en-US"/>
+              <w:kern w:val="2"/>
+              <w:sz w:val="24"/>
+              <w:szCs w:val="24"/>
+              <w:lang w:val="en-LU" w:eastAsia="en-GB"/>
+              <w14:ligatures w14:val="standardContextual"/>
             </w:rPr>
           </w:pPr>
-          <w:hyperlink w:anchor="_Toc75418883" w:history="1">
+          <w:hyperlink w:anchor="_Toc229569538" w:history="1">
             <w:r>
               <w:rPr>
                 <w:rStyle w:val="Hyperlink"/>
@@ -2148,9 +2198,11 @@
                 <w:i w:val="0"/>
                 <w:iCs w:val="0"/>
                 <w:noProof/>
-                <w:sz w:val="22"/>
-                <w:szCs w:val="22"/>
-                <w:lang w:eastAsia="en-US"/>
+                <w:kern w:val="2"/>
+                <w:sz w:val="24"/>
+                <w:szCs w:val="24"/>
+                <w:lang w:val="en-LU" w:eastAsia="en-GB"/>
+                <w14:ligatures w14:val="standardContextual"/>
               </w:rPr>
               <w:tab/>
             </w:r>
@@ -2180,7 +2232,7 @@
                 <w:noProof/>
                 <w:webHidden/>
               </w:rPr>
-              <w:instrText xml:space="preserve"> PAGEREF _Toc75418883 \h </w:instrText>
+              <w:instrText xml:space="preserve"> PAGEREF _Toc229569538 \h </w:instrText>
             </w:r>
             <w:r>
               <w:rPr>
@@ -2223,12 +2275,14 @@
               <w:i w:val="0"/>
               <w:iCs w:val="0"/>
               <w:noProof/>
-              <w:sz w:val="22"/>
-              <w:szCs w:val="22"/>
-              <w:lang w:eastAsia="en-US"/>
+              <w:kern w:val="2"/>
+              <w:sz w:val="24"/>
+              <w:szCs w:val="24"/>
+              <w:lang w:val="en-LU" w:eastAsia="en-GB"/>
+              <w14:ligatures w14:val="standardContextual"/>
             </w:rPr>
           </w:pPr>
-          <w:hyperlink w:anchor="_Toc75418884" w:history="1">
+          <w:hyperlink w:anchor="_Toc229569539" w:history="1">
             <w:r>
               <w:rPr>
                 <w:rStyle w:val="Hyperlink"/>
@@ -2243,9 +2297,11 @@
                 <w:i w:val="0"/>
                 <w:iCs w:val="0"/>
                 <w:noProof/>
-                <w:sz w:val="22"/>
-                <w:szCs w:val="22"/>
-                <w:lang w:eastAsia="en-US"/>
+                <w:kern w:val="2"/>
+                <w:sz w:val="24"/>
+                <w:szCs w:val="24"/>
+                <w:lang w:val="en-LU" w:eastAsia="en-GB"/>
+                <w14:ligatures w14:val="standardContextual"/>
               </w:rPr>
               <w:tab/>
             </w:r>
@@ -2275,7 +2331,7 @@
                 <w:noProof/>
                 <w:webHidden/>
               </w:rPr>
-              <w:instrText xml:space="preserve"> PAGEREF _Toc75418884 \h </w:instrText>
+              <w:instrText xml:space="preserve"> PAGEREF _Toc229569539 \h </w:instrText>
             </w:r>
             <w:r>
               <w:rPr>
@@ -2318,12 +2374,14 @@
               <w:i w:val="0"/>
               <w:iCs w:val="0"/>
               <w:noProof/>
-              <w:sz w:val="22"/>
-              <w:szCs w:val="22"/>
-              <w:lang w:eastAsia="en-US"/>
+              <w:kern w:val="2"/>
+              <w:sz w:val="24"/>
+              <w:szCs w:val="24"/>
+              <w:lang w:val="en-LU" w:eastAsia="en-GB"/>
+              <w14:ligatures w14:val="standardContextual"/>
             </w:rPr>
           </w:pPr>
-          <w:hyperlink w:anchor="_Toc75418885" w:history="1">
+          <w:hyperlink w:anchor="_Toc229569540" w:history="1">
             <w:r>
               <w:rPr>
                 <w:rStyle w:val="Hyperlink"/>
@@ -2338,9 +2396,11 @@
                 <w:i w:val="0"/>
                 <w:iCs w:val="0"/>
                 <w:noProof/>
-                <w:sz w:val="22"/>
-                <w:szCs w:val="22"/>
-                <w:lang w:eastAsia="en-US"/>
+                <w:kern w:val="2"/>
+                <w:sz w:val="24"/>
+                <w:szCs w:val="24"/>
+                <w:lang w:val="en-LU" w:eastAsia="en-GB"/>
+                <w14:ligatures w14:val="standardContextual"/>
               </w:rPr>
               <w:tab/>
             </w:r>
@@ -2370,7 +2430,7 @@
                 <w:noProof/>
                 <w:webHidden/>
               </w:rPr>
-              <w:instrText xml:space="preserve"> PAGEREF _Toc75418885 \h </w:instrText>
+              <w:instrText xml:space="preserve"> PAGEREF _Toc229569540 \h </w:instrText>
             </w:r>
             <w:r>
               <w:rPr>
@@ -2412,12 +2472,14 @@
               <w:rFonts w:asciiTheme="minorHAnsi" w:eastAsiaTheme="minorEastAsia" w:hAnsiTheme="minorHAnsi" w:cstheme="minorBidi"/>
               <w:smallCaps w:val="0"/>
               <w:noProof/>
-              <w:sz w:val="22"/>
-              <w:szCs w:val="22"/>
-              <w:lang w:eastAsia="en-US"/>
+              <w:kern w:val="2"/>
+              <w:sz w:val="24"/>
+              <w:szCs w:val="24"/>
+              <w:lang w:val="en-LU" w:eastAsia="en-GB"/>
+              <w14:ligatures w14:val="standardContextual"/>
             </w:rPr>
           </w:pPr>
-          <w:hyperlink w:anchor="_Toc75418886" w:history="1">
+          <w:hyperlink w:anchor="_Toc229569541" w:history="1">
             <w:r>
               <w:rPr>
                 <w:rStyle w:val="Hyperlink"/>
@@ -2432,9 +2494,11 @@
                 <w:rFonts w:asciiTheme="minorHAnsi" w:eastAsiaTheme="minorEastAsia" w:hAnsiTheme="minorHAnsi" w:cstheme="minorBidi"/>
                 <w:smallCaps w:val="0"/>
                 <w:noProof/>
-                <w:sz w:val="22"/>
-                <w:szCs w:val="22"/>
-                <w:lang w:eastAsia="en-US"/>
+                <w:kern w:val="2"/>
+                <w:sz w:val="24"/>
+                <w:szCs w:val="24"/>
+                <w:lang w:val="en-LU" w:eastAsia="en-GB"/>
+                <w14:ligatures w14:val="standardContextual"/>
               </w:rPr>
               <w:tab/>
             </w:r>
@@ -2464,7 +2528,7 @@
                 <w:noProof/>
                 <w:webHidden/>
               </w:rPr>
-              <w:instrText xml:space="preserve"> PAGEREF _Toc75418886 \h </w:instrText>
+              <w:instrText xml:space="preserve"> PAGEREF _Toc229569541 \h </w:instrText>
             </w:r>
             <w:r>
               <w:rPr>
@@ -2485,6 +2549,105 @@
                 <w:webHidden/>
               </w:rPr>
               <w:t>5</w:t>
+            </w:r>
+            <w:r>
+              <w:rPr>
+                <w:noProof/>
+                <w:webHidden/>
+              </w:rPr>
+              <w:fldChar w:fldCharType="end"/>
+            </w:r>
+          </w:hyperlink>
+        </w:p>
+        <w:p>
+          <w:pPr>
+            <w:pStyle w:val="TOC2"/>
+            <w:tabs>
+              <w:tab w:val="left" w:pos="880"/>
+              <w:tab w:val="right" w:leader="dot" w:pos="9764"/>
+            </w:tabs>
+            <w:rPr>
+              <w:rFonts w:asciiTheme="minorHAnsi" w:eastAsiaTheme="minorEastAsia" w:hAnsiTheme="minorHAnsi" w:cstheme="minorBidi"/>
+              <w:smallCaps w:val="0"/>
+              <w:noProof/>
+              <w:kern w:val="2"/>
+              <w:sz w:val="24"/>
+              <w:szCs w:val="24"/>
+              <w:lang w:val="en-LU" w:eastAsia="en-GB"/>
+              <w14:ligatures w14:val="standardContextual"/>
+            </w:rPr>
+          </w:pPr>
+          <w:hyperlink w:anchor="_Toc229569542" w:history="1">
+            <w:r>
+              <w:rPr>
+                <w:rStyle w:val="Hyperlink"/>
+                <w:noProof/>
+                <w:snapToGrid w:val="0"/>
+                <w:w w:val="0"/>
+                <w:lang w:val="fr-LU"/>
+              </w:rPr>
+              <w:t>2.4</w:t>
+            </w:r>
+            <w:r>
+              <w:rPr>
+                <w:rFonts w:asciiTheme="minorHAnsi" w:eastAsiaTheme="minorEastAsia" w:hAnsiTheme="minorHAnsi" w:cstheme="minorBidi"/>
+                <w:smallCaps w:val="0"/>
+                <w:noProof/>
+                <w:kern w:val="2"/>
+                <w:sz w:val="24"/>
+                <w:szCs w:val="24"/>
+                <w:lang w:val="en-LU" w:eastAsia="en-GB"/>
+                <w14:ligatures w14:val="standardContextual"/>
+              </w:rPr>
+              <w:tab/>
+            </w:r>
+            <w:r>
+              <w:rPr>
+                <w:rStyle w:val="Hyperlink"/>
+                <w:noProof/>
+              </w:rPr>
+              <w:t>Auslöser für eine Neubewertung</w:t>
+            </w:r>
+            <w:r>
+              <w:rPr>
+                <w:noProof/>
+                <w:webHidden/>
+              </w:rPr>
+              <w:tab/>
+            </w:r>
+            <w:r>
+              <w:rPr>
+                <w:noProof/>
+                <w:webHidden/>
+              </w:rPr>
+              <w:fldChar w:fldCharType="begin"/>
+            </w:r>
+            <w:r>
+              <w:rPr>
+                <w:noProof/>
+                <w:webHidden/>
+              </w:rPr>
+              <w:instrText xml:space="preserve"> PAGEREF _Toc229569542 \h </w:instrText>
+            </w:r>
+            <w:r>
+              <w:rPr>
+                <w:noProof/>
+                <w:webHidden/>
+              </w:rPr>
+            </w:r>
+            <w:r>
+              <w:rPr>
+                <w:noProof/>
+                <w:webHidden/>
+              </w:rPr>
+              <w:fldChar w:fldCharType="separate"/>
+            </w:r>
+            <w:r>
+              <w:rPr>
+                <w:noProof/>
+                <w:webHidden/>
+              </w:rPr>
+              <w:t>6</w:t>
             </w:r>
             <w:r>
               <w:rPr>
@@ -2507,12 +2670,14 @@
               <w:bCs w:val="0"/>
               <w:caps w:val="0"/>
               <w:noProof/>
-              <w:sz w:val="22"/>
-              <w:szCs w:val="22"/>
-              <w:lang w:eastAsia="en-US"/>
+              <w:kern w:val="2"/>
+              <w:sz w:val="24"/>
+              <w:szCs w:val="24"/>
+              <w:lang w:val="en-LU" w:eastAsia="en-GB"/>
+              <w14:ligatures w14:val="standardContextual"/>
             </w:rPr>
           </w:pPr>
-          <w:hyperlink w:anchor="_Toc75418887" w:history="1">
+          <w:hyperlink w:anchor="_Toc229569543" w:history="1">
             <w:r>
               <w:rPr>
                 <w:rStyle w:val="Hyperlink"/>
@@ -2539,7 +2704,7 @@
                 <w:noProof/>
                 <w:webHidden/>
               </w:rPr>
-              <w:instrText xml:space="preserve"> PAGEREF _Toc75418887 \h </w:instrText>
+              <w:instrText xml:space="preserve"> PAGEREF _Toc229569543 \h </w:instrText>
             </w:r>
             <w:r>
               <w:rPr>
@@ -2559,7 +2724,7 @@
                 <w:noProof/>
                 <w:webHidden/>
               </w:rPr>
-              <w:t>6</w:t>
+              <w:t>7</w:t>
             </w:r>
             <w:r>
               <w:rPr>
@@ -2582,12 +2747,14 @@
               <w:bCs w:val="0"/>
               <w:caps w:val="0"/>
               <w:noProof/>
-              <w:sz w:val="22"/>
-              <w:szCs w:val="22"/>
-              <w:lang w:eastAsia="en-US"/>
+              <w:kern w:val="2"/>
+              <w:sz w:val="24"/>
+              <w:szCs w:val="24"/>
+              <w:lang w:val="en-LU" w:eastAsia="en-GB"/>
+              <w14:ligatures w14:val="standardContextual"/>
             </w:rPr>
           </w:pPr>
-          <w:hyperlink w:anchor="_Toc75418888" w:history="1">
+          <w:hyperlink w:anchor="_Toc229569544" w:history="1">
             <w:r>
               <w:rPr>
                 <w:rStyle w:val="Hyperlink"/>
@@ -2614,7 +2781,7 @@
                 <w:noProof/>
                 <w:webHidden/>
               </w:rPr>
-              <w:instrText xml:space="preserve"> PAGEREF _Toc75418888 \h </w:instrText>
+              <w:instrText xml:space="preserve"> PAGEREF _Toc229569544 \h </w:instrText>
             </w:r>
             <w:r>
               <w:rPr>
@@ -2634,7 +2801,7 @@
                 <w:noProof/>
                 <w:webHidden/>
               </w:rPr>
-              <w:t>7</w:t>
+              <w:t>8</w:t>
             </w:r>
             <w:r>
               <w:rPr>
@@ -2657,12 +2824,14 @@
               <w:bCs w:val="0"/>
               <w:caps w:val="0"/>
               <w:noProof/>
-              <w:sz w:val="22"/>
-              <w:szCs w:val="22"/>
-              <w:lang w:eastAsia="en-US"/>
+              <w:kern w:val="2"/>
+              <w:sz w:val="24"/>
+              <w:szCs w:val="24"/>
+              <w:lang w:val="en-LU" w:eastAsia="en-GB"/>
+              <w14:ligatures w14:val="standardContextual"/>
             </w:rPr>
           </w:pPr>
-          <w:hyperlink w:anchor="_Toc75418889" w:history="1">
+          <w:hyperlink w:anchor="_Toc229569545" w:history="1">
             <w:r>
               <w:rPr>
                 <w:rStyle w:val="Hyperlink"/>
@@ -2689,7 +2858,7 @@
                 <w:noProof/>
                 <w:webHidden/>
               </w:rPr>
-              <w:instrText xml:space="preserve"> PAGEREF _Toc75418889 \h </w:instrText>
+              <w:instrText xml:space="preserve"> PAGEREF _Toc229569545 \h </w:instrText>
             </w:r>
             <w:r>
               <w:rPr>
@@ -2709,7 +2878,7 @@
                 <w:noProof/>
                 <w:webHidden/>
               </w:rPr>
-              <w:t>8</w:t>
+              <w:t>9</w:t>
             </w:r>
             <w:r>
               <w:rPr>
@@ -2923,7 +3092,6 @@
         <w:ind w:right="0"/>
         <w:jc w:val="left"/>
       </w:pPr>
-      <w:bookmarkStart w:id="8" w:name="_GoBack"/>
     </w:p>
     <w:p>
       <w:pPr>
@@ -2936,14 +3104,13 @@
           <w:lang w:val="fr-BE"/>
         </w:rPr>
       </w:pPr>
-      <w:bookmarkStart w:id="9" w:name="_Toc75418871"/>
-      <w:bookmarkEnd w:id="8"/>
+      <w:bookmarkStart w:id="8" w:name="_Toc229569526"/>
       <w:proofErr w:type="spellStart"/>
       <w:r>
         <w:lastRenderedPageBreak/>
         <w:t>Einleitung</w:t>
       </w:r>
-      <w:bookmarkEnd w:id="9"/>
+      <w:bookmarkEnd w:id="8"/>
       <w:proofErr w:type="spellEnd"/>
     </w:p>
     <w:p>
@@ -3021,8 +3188,8 @@
         </w:numPr>
         <w:spacing w:before="0"/>
       </w:pPr>
-      <w:bookmarkStart w:id="10" w:name="_Toc450917895"/>
-      <w:bookmarkStart w:id="11" w:name="_Toc75418872"/>
+      <w:bookmarkStart w:id="9" w:name="_Toc450917895"/>
+      <w:bookmarkStart w:id="10" w:name="_Toc229569527"/>
       <w:proofErr w:type="spellStart"/>
       <w:r>
         <w:t>Zweck</w:t>
@@ -3035,8 +3202,8 @@
       <w:r>
         <w:t>Dokuments</w:t>
       </w:r>
+      <w:bookmarkEnd w:id="9"/>
       <w:bookmarkEnd w:id="10"/>
-      <w:bookmarkEnd w:id="11"/>
       <w:proofErr w:type="spellEnd"/>
     </w:p>
     <w:p>
@@ -3081,23 +3248,7 @@
       </w:r>
       <w:proofErr w:type="spellEnd"/>
       <w:r>
-        <w:t xml:space="preserve"> </w:t>
-      </w:r>
-      <w:proofErr w:type="spellStart"/>
-      <w:r>
-        <w:t>er</w:t>
-      </w:r>
-      <w:proofErr w:type="spellEnd"/>
-      <w:r>
-        <w:t xml:space="preserve"> von den </w:t>
-      </w:r>
-      <w:proofErr w:type="spellStart"/>
-      <w:r>
-        <w:t>für</w:t>
-      </w:r>
-      <w:proofErr w:type="spellEnd"/>
-      <w:r>
-        <w:t xml:space="preserve"> das </w:t>
+        <w:t xml:space="preserve"> er von den für das </w:t>
       </w:r>
       <w:proofErr w:type="spellStart"/>
       <w:r>
@@ -3150,11 +3301,11 @@
       </w:r>
       <w:proofErr w:type="spellEnd"/>
       <w:r>
-        <w:t xml:space="preserve"> muss </w:t>
-      </w:r>
-      <w:proofErr w:type="spellStart"/>
-      <w:r>
-        <w:t>für</w:t>
+        <w:t xml:space="preserve"> muss für </w:t>
+      </w:r>
+      <w:proofErr w:type="spellStart"/>
+      <w:r>
+        <w:t>eine</w:t>
       </w:r>
       <w:proofErr w:type="spellEnd"/>
       <w:r>
@@ -3162,7 +3313,15 @@
       </w:r>
       <w:proofErr w:type="spellStart"/>
       <w:r>
-        <w:t>eine</w:t>
+        <w:t>Fortführung</w:t>
+      </w:r>
+      <w:proofErr w:type="spellEnd"/>
+      <w:r>
+        <w:t xml:space="preserve"> des </w:t>
+      </w:r>
+      <w:proofErr w:type="spellStart"/>
+      <w:r>
+        <w:t>Projekts</w:t>
       </w:r>
       <w:proofErr w:type="spellEnd"/>
       <w:r>
@@ -3170,15 +3329,15 @@
       </w:r>
       <w:proofErr w:type="spellStart"/>
       <w:r>
-        <w:t>Fortführung</w:t>
-      </w:r>
-      <w:proofErr w:type="spellEnd"/>
-      <w:r>
-        <w:t xml:space="preserve"> des </w:t>
-      </w:r>
-      <w:proofErr w:type="spellStart"/>
-      <w:r>
-        <w:t>Projekts</w:t>
+        <w:t>vom</w:t>
+      </w:r>
+      <w:proofErr w:type="spellEnd"/>
+      <w:r>
+        <w:t xml:space="preserve"> Management der </w:t>
+      </w:r>
+      <w:proofErr w:type="spellStart"/>
+      <w:r>
+        <w:t>Zielorganisation</w:t>
       </w:r>
       <w:proofErr w:type="spellEnd"/>
       <w:r>
@@ -3186,15 +3345,7 @@
       </w:r>
       <w:proofErr w:type="spellStart"/>
       <w:r>
-        <w:t>vom</w:t>
-      </w:r>
-      <w:proofErr w:type="spellEnd"/>
-      <w:r>
-        <w:t xml:space="preserve"> Management der </w:t>
-      </w:r>
-      <w:proofErr w:type="spellStart"/>
-      <w:r>
-        <w:t>Zielorganisation</w:t>
+        <w:t>unterzeichnet</w:t>
       </w:r>
       <w:proofErr w:type="spellEnd"/>
       <w:r>
@@ -3202,7 +3353,15 @@
       </w:r>
       <w:proofErr w:type="spellStart"/>
       <w:r>
-        <w:t>unterzeichnet</w:t>
+        <w:t>werden</w:t>
+      </w:r>
+      <w:proofErr w:type="spellEnd"/>
+      <w:r>
+        <w:t xml:space="preserve">, um </w:t>
+      </w:r>
+      <w:proofErr w:type="spellStart"/>
+      <w:r>
+        <w:t>zu</w:t>
       </w:r>
       <w:proofErr w:type="spellEnd"/>
       <w:r>
@@ -3210,22 +3369,6 @@
       </w:r>
       <w:proofErr w:type="spellStart"/>
       <w:r>
-        <w:t>werden</w:t>
-      </w:r>
-      <w:proofErr w:type="spellEnd"/>
-      <w:r>
-        <w:t xml:space="preserve">, um </w:t>
-      </w:r>
-      <w:proofErr w:type="spellStart"/>
-      <w:r>
-        <w:t>zu</w:t>
-      </w:r>
-      <w:proofErr w:type="spellEnd"/>
-      <w:r>
-        <w:t xml:space="preserve"> </w:t>
-      </w:r>
-      <w:proofErr w:type="spellStart"/>
-      <w:r>
         <w:t>bestätigen</w:t>
       </w:r>
       <w:proofErr w:type="spellEnd"/>
@@ -3238,15 +3381,7 @@
       </w:r>
       <w:proofErr w:type="spellEnd"/>
       <w:r>
-        <w:t xml:space="preserve"> </w:t>
-      </w:r>
-      <w:proofErr w:type="spellStart"/>
-      <w:r>
-        <w:t>es</w:t>
-      </w:r>
-      <w:proofErr w:type="spellEnd"/>
-      <w:r>
-        <w:t xml:space="preserve"> </w:t>
+        <w:t xml:space="preserve"> es </w:t>
       </w:r>
       <w:proofErr w:type="spellStart"/>
       <w:r>
@@ -3284,8 +3419,8 @@
           <w:lang w:val="fr-LU"/>
         </w:rPr>
       </w:pPr>
-      <w:bookmarkStart w:id="12" w:name="_Toc450917897"/>
-      <w:bookmarkStart w:id="13" w:name="_Toc75418873"/>
+      <w:bookmarkStart w:id="11" w:name="_Toc450917897"/>
+      <w:bookmarkStart w:id="12" w:name="_Toc229569528"/>
       <w:proofErr w:type="spellStart"/>
       <w:r>
         <w:t>Akronyme</w:t>
@@ -3298,8 +3433,8 @@
       <w:r>
         <w:t>Begriffe</w:t>
       </w:r>
+      <w:bookmarkEnd w:id="11"/>
       <w:bookmarkEnd w:id="12"/>
-      <w:bookmarkEnd w:id="13"/>
       <w:proofErr w:type="spellEnd"/>
       <w:r>
         <w:rPr>
@@ -3321,15 +3456,7 @@
       </w:r>
       <w:proofErr w:type="spellEnd"/>
       <w:r>
-        <w:t xml:space="preserve"> Element, das </w:t>
-      </w:r>
-      <w:proofErr w:type="spellStart"/>
-      <w:r>
-        <w:t>für</w:t>
-      </w:r>
-      <w:proofErr w:type="spellEnd"/>
-      <w:r>
-        <w:t xml:space="preserve"> die </w:t>
+        <w:t xml:space="preserve"> Element, das für die </w:t>
       </w:r>
       <w:proofErr w:type="spellStart"/>
       <w:r>
@@ -3411,15 +3538,7 @@
       </w:r>
       <w:proofErr w:type="spellEnd"/>
       <w:r>
-        <w:t xml:space="preserve"> </w:t>
-      </w:r>
-      <w:proofErr w:type="spellStart"/>
-      <w:r>
-        <w:t>für</w:t>
-      </w:r>
-      <w:proofErr w:type="spellEnd"/>
-      <w:r>
-        <w:t xml:space="preserve"> </w:t>
+        <w:t xml:space="preserve"> für </w:t>
       </w:r>
       <w:proofErr w:type="spellStart"/>
       <w:r>
@@ -3581,15 +3700,7 @@
       </w:r>
       <w:proofErr w:type="spellEnd"/>
       <w:r>
-        <w:t xml:space="preserve"> </w:t>
-      </w:r>
-      <w:proofErr w:type="spellStart"/>
-      <w:r>
-        <w:t>Stelle</w:t>
-      </w:r>
-      <w:proofErr w:type="spellEnd"/>
-      <w:r>
-        <w:t xml:space="preserve"> </w:t>
+        <w:t xml:space="preserve"> Stelle </w:t>
       </w:r>
       <w:proofErr w:type="spellStart"/>
       <w:r>
@@ -3796,8 +3907,8 @@
           <w:lang w:val="fr-LU"/>
         </w:rPr>
       </w:pPr>
-      <w:bookmarkStart w:id="14" w:name="_Toc450917899"/>
-      <w:bookmarkStart w:id="15" w:name="_Toc75418874"/>
+      <w:bookmarkStart w:id="13" w:name="_Toc450917899"/>
+      <w:bookmarkStart w:id="14" w:name="_Toc229569529"/>
       <w:proofErr w:type="spellStart"/>
       <w:r>
         <w:lastRenderedPageBreak/>
@@ -3811,8 +3922,8 @@
       <w:r>
         <w:t>Kontextes</w:t>
       </w:r>
+      <w:bookmarkEnd w:id="13"/>
       <w:bookmarkEnd w:id="14"/>
-      <w:bookmarkEnd w:id="15"/>
       <w:proofErr w:type="spellEnd"/>
     </w:p>
     <w:p>
@@ -3826,9 +3937,9 @@
           <w:lang w:val="fr-LU"/>
         </w:rPr>
       </w:pPr>
-      <w:bookmarkStart w:id="16" w:name="_Toc450917900"/>
-      <w:bookmarkStart w:id="17" w:name="_Toc75418875"/>
-      <w:bookmarkStart w:id="18" w:name="_Toc354489473"/>
+      <w:bookmarkStart w:id="15" w:name="_Toc450917900"/>
+      <w:bookmarkStart w:id="16" w:name="_Toc229569530"/>
+      <w:bookmarkStart w:id="17" w:name="_Toc354489473"/>
       <w:proofErr w:type="spellStart"/>
       <w:r>
         <w:t>Beschreibung</w:t>
@@ -3841,16 +3952,16 @@
       <w:r>
         <w:t>Kontextes</w:t>
       </w:r>
+      <w:bookmarkEnd w:id="15"/>
       <w:bookmarkEnd w:id="16"/>
+      <w:proofErr w:type="spellEnd"/>
+      <w:r>
+        <w:rPr>
+          <w:lang w:val="fr-LU"/>
+        </w:rPr>
+        <w:t xml:space="preserve"> </w:t>
+      </w:r>
       <w:bookmarkEnd w:id="17"/>
-      <w:proofErr w:type="spellEnd"/>
-      <w:r>
-        <w:rPr>
-          <w:lang w:val="fr-LU"/>
-        </w:rPr>
-        <w:t xml:space="preserve"> </w:t>
-      </w:r>
-      <w:bookmarkEnd w:id="18"/>
     </w:p>
     <w:p>
       <w:pPr>
@@ -3872,9 +3983,9 @@
         </w:numPr>
         <w:spacing w:before="0"/>
       </w:pPr>
-      <w:bookmarkStart w:id="19" w:name="_Toc354489474"/>
-      <w:bookmarkStart w:id="20" w:name="_Toc450917901"/>
-      <w:bookmarkStart w:id="21" w:name="_Toc75418876"/>
+      <w:bookmarkStart w:id="18" w:name="_Toc354489474"/>
+      <w:bookmarkStart w:id="19" w:name="_Toc450917901"/>
+      <w:bookmarkStart w:id="20" w:name="_Toc229569531"/>
       <w:proofErr w:type="spellStart"/>
       <w:r>
         <w:t>Festlegung</w:t>
@@ -3889,23 +4000,15 @@
       </w:r>
       <w:proofErr w:type="spellEnd"/>
       <w:r>
-        <w:t xml:space="preserve"> </w:t>
-      </w:r>
-      <w:proofErr w:type="spellStart"/>
-      <w:r>
-        <w:t>für</w:t>
-      </w:r>
-      <w:proofErr w:type="spellEnd"/>
-      <w:r>
-        <w:t xml:space="preserve"> die </w:t>
+        <w:t xml:space="preserve"> für die </w:t>
       </w:r>
       <w:proofErr w:type="spellStart"/>
       <w:r>
         <w:t>Risikobewertung</w:t>
       </w:r>
+      <w:bookmarkEnd w:id="18"/>
       <w:bookmarkEnd w:id="19"/>
       <w:bookmarkEnd w:id="20"/>
-      <w:bookmarkEnd w:id="21"/>
       <w:proofErr w:type="spellEnd"/>
     </w:p>
     <w:p>
@@ -3920,12 +4023,12 @@
           <w:lang w:val="fr-LU"/>
         </w:rPr>
       </w:pPr>
-      <w:bookmarkStart w:id="22" w:name="_Toc75418877"/>
+      <w:bookmarkStart w:id="21" w:name="_Toc229569532"/>
       <w:proofErr w:type="spellStart"/>
       <w:r>
         <w:t>Informationsrisiken</w:t>
       </w:r>
-      <w:bookmarkEnd w:id="22"/>
+      <w:bookmarkEnd w:id="21"/>
       <w:proofErr w:type="spellEnd"/>
     </w:p>
     <w:p>
@@ -3939,24 +4042,19 @@
           <w:lang w:val="fr-LU"/>
         </w:rPr>
       </w:pPr>
-      <w:bookmarkStart w:id="23" w:name="_Toc354489475"/>
-      <w:bookmarkStart w:id="24" w:name="_Toc450917902"/>
-      <w:bookmarkStart w:id="25" w:name="_Toc75418878"/>
-      <w:proofErr w:type="spellStart"/>
-      <w:r>
-        <w:t>Skala</w:t>
-      </w:r>
-      <w:proofErr w:type="spellEnd"/>
-      <w:r>
-        <w:t xml:space="preserve"> </w:t>
+      <w:bookmarkStart w:id="22" w:name="_Toc354489475"/>
+      <w:bookmarkStart w:id="23" w:name="_Toc450917902"/>
+      <w:bookmarkStart w:id="24" w:name="_Toc229569533"/>
+      <w:r>
+        <w:t xml:space="preserve">Skala </w:t>
       </w:r>
       <w:proofErr w:type="spellStart"/>
       <w:r>
         <w:t>Auswirkungen</w:t>
       </w:r>
+      <w:bookmarkEnd w:id="22"/>
       <w:bookmarkEnd w:id="23"/>
       <w:bookmarkEnd w:id="24"/>
-      <w:bookmarkEnd w:id="25"/>
       <w:proofErr w:type="spellEnd"/>
     </w:p>
     <w:p>
@@ -4185,17 +4283,12 @@
         <w:t xml:space="preserve"> </w:t>
       </w:r>
       <w:proofErr w:type="spellStart"/>
-      <w:proofErr w:type="gramStart"/>
       <w:r>
         <w:t>Auswirkung</w:t>
       </w:r>
       <w:proofErr w:type="spellEnd"/>
       <w:r>
-        <w:t>“</w:t>
-      </w:r>
-      <w:proofErr w:type="gramEnd"/>
-      <w:r>
-        <w:t xml:space="preserve">, </w:t>
+        <w:t xml:space="preserve">“, </w:t>
       </w:r>
       <w:proofErr w:type="spellStart"/>
       <w:r>
@@ -4256,22 +4349,17 @@
           <w:numId w:val="1"/>
         </w:numPr>
       </w:pPr>
-      <w:bookmarkStart w:id="26" w:name="_Toc450917903"/>
-      <w:bookmarkStart w:id="27" w:name="_Toc75418879"/>
-      <w:proofErr w:type="spellStart"/>
-      <w:r>
-        <w:t>Skala</w:t>
-      </w:r>
-      <w:proofErr w:type="spellEnd"/>
-      <w:r>
-        <w:t xml:space="preserve"> </w:t>
+      <w:bookmarkStart w:id="25" w:name="_Toc450917903"/>
+      <w:bookmarkStart w:id="26" w:name="_Toc229569534"/>
+      <w:r>
+        <w:t xml:space="preserve">Skala </w:t>
       </w:r>
       <w:proofErr w:type="spellStart"/>
       <w:r>
         <w:t>Bedrohungen</w:t>
       </w:r>
+      <w:bookmarkEnd w:id="25"/>
       <w:bookmarkEnd w:id="26"/>
-      <w:bookmarkEnd w:id="27"/>
       <w:proofErr w:type="spellEnd"/>
     </w:p>
     <w:p>
@@ -4311,23 +4399,7 @@
       </w:r>
       <w:proofErr w:type="spellEnd"/>
       <w:r>
-        <w:t xml:space="preserve"> </w:t>
-      </w:r>
-      <w:proofErr w:type="spellStart"/>
-      <w:r>
-        <w:t>Skala</w:t>
-      </w:r>
-      <w:proofErr w:type="spellEnd"/>
-      <w:r>
-        <w:t xml:space="preserve"> </w:t>
-      </w:r>
-      <w:proofErr w:type="spellStart"/>
-      <w:r>
-        <w:t>für</w:t>
-      </w:r>
-      <w:proofErr w:type="spellEnd"/>
-      <w:r>
-        <w:t xml:space="preserve"> die </w:t>
+        <w:t xml:space="preserve"> Skala für die </w:t>
       </w:r>
       <w:proofErr w:type="spellStart"/>
       <w:r>
@@ -4405,22 +4477,17 @@
           <w:numId w:val="1"/>
         </w:numPr>
       </w:pPr>
-      <w:bookmarkStart w:id="28" w:name="_Toc450917904"/>
-      <w:bookmarkStart w:id="29" w:name="_Toc75418880"/>
-      <w:proofErr w:type="spellStart"/>
-      <w:r>
-        <w:t>Skala</w:t>
-      </w:r>
-      <w:proofErr w:type="spellEnd"/>
-      <w:r>
-        <w:t xml:space="preserve"> </w:t>
+      <w:bookmarkStart w:id="27" w:name="_Toc450917904"/>
+      <w:bookmarkStart w:id="28" w:name="_Toc229569535"/>
+      <w:r>
+        <w:t xml:space="preserve">Skala </w:t>
       </w:r>
       <w:proofErr w:type="spellStart"/>
       <w:r>
         <w:t>Sicherheitslücken</w:t>
       </w:r>
+      <w:bookmarkEnd w:id="27"/>
       <w:bookmarkEnd w:id="28"/>
-      <w:bookmarkEnd w:id="29"/>
       <w:proofErr w:type="spellEnd"/>
     </w:p>
     <w:p>
@@ -4460,27 +4527,43 @@
       </w:r>
       <w:proofErr w:type="spellEnd"/>
       <w:r>
+        <w:t xml:space="preserve"> Skala, die </w:t>
+      </w:r>
+      <w:proofErr w:type="spellStart"/>
+      <w:r>
+        <w:t>beschreibt</w:t>
+      </w:r>
+      <w:proofErr w:type="spellEnd"/>
+      <w:r>
+        <w:t xml:space="preserve">, in </w:t>
+      </w:r>
+      <w:proofErr w:type="spellStart"/>
+      <w:r>
+        <w:t>welchem</w:t>
+      </w:r>
+      <w:proofErr w:type="spellEnd"/>
+      <w:r>
         <w:t xml:space="preserve"> </w:t>
       </w:r>
       <w:proofErr w:type="spellStart"/>
       <w:r>
-        <w:t>Skala</w:t>
-      </w:r>
-      <w:proofErr w:type="spellEnd"/>
-      <w:r>
-        <w:t xml:space="preserve">, die </w:t>
-      </w:r>
-      <w:proofErr w:type="spellStart"/>
-      <w:r>
-        <w:t>beschreibt</w:t>
-      </w:r>
-      <w:proofErr w:type="spellEnd"/>
-      <w:r>
-        <w:t xml:space="preserve">, in </w:t>
-      </w:r>
-      <w:proofErr w:type="spellStart"/>
-      <w:r>
-        <w:t>welchem</w:t>
+        <w:t>Maße</w:t>
+      </w:r>
+      <w:proofErr w:type="spellEnd"/>
+      <w:r>
+        <w:t xml:space="preserve"> das </w:t>
+      </w:r>
+      <w:proofErr w:type="spellStart"/>
+      <w:r>
+        <w:t>betreffende</w:t>
+      </w:r>
+      <w:proofErr w:type="spellEnd"/>
+      <w:r>
+        <w:t xml:space="preserve"> Asset </w:t>
+      </w:r>
+      <w:proofErr w:type="spellStart"/>
+      <w:r>
+        <w:t>mit</w:t>
       </w:r>
       <w:proofErr w:type="spellEnd"/>
       <w:r>
@@ -4488,23 +4571,7 @@
       </w:r>
       <w:proofErr w:type="spellStart"/>
       <w:r>
-        <w:t>Maße</w:t>
-      </w:r>
-      <w:proofErr w:type="spellEnd"/>
-      <w:r>
-        <w:t xml:space="preserve"> das </w:t>
-      </w:r>
-      <w:proofErr w:type="spellStart"/>
-      <w:r>
-        <w:t>betreffende</w:t>
-      </w:r>
-      <w:proofErr w:type="spellEnd"/>
-      <w:r>
-        <w:t xml:space="preserve"> Asset </w:t>
-      </w:r>
-      <w:proofErr w:type="spellStart"/>
-      <w:r>
-        <w:t>mit</w:t>
+        <w:t>Sicherheitslücken</w:t>
       </w:r>
       <w:proofErr w:type="spellEnd"/>
       <w:r>
@@ -4512,7 +4579,7 @@
       </w:r>
       <w:proofErr w:type="spellStart"/>
       <w:r>
-        <w:t>Sicherheitslücken</w:t>
+        <w:t>behaftet</w:t>
       </w:r>
       <w:proofErr w:type="spellEnd"/>
       <w:r>
@@ -4520,27 +4587,11 @@
       </w:r>
       <w:proofErr w:type="spellStart"/>
       <w:r>
-        <w:t>behaftet</w:t>
-      </w:r>
-      <w:proofErr w:type="spellEnd"/>
-      <w:r>
-        <w:t xml:space="preserve"> </w:t>
-      </w:r>
-      <w:proofErr w:type="spellStart"/>
-      <w:r>
         <w:t>ist</w:t>
       </w:r>
       <w:proofErr w:type="spellEnd"/>
       <w:r>
-        <w:t xml:space="preserve">. </w:t>
-      </w:r>
-      <w:proofErr w:type="spellStart"/>
-      <w:r>
-        <w:t>Bei</w:t>
-      </w:r>
-      <w:proofErr w:type="spellEnd"/>
-      <w:r>
-        <w:t xml:space="preserve"> der </w:t>
+        <w:t xml:space="preserve">. Bei der </w:t>
       </w:r>
       <w:proofErr w:type="spellStart"/>
       <w:r>
@@ -4639,15 +4690,15 @@
           <w:numId w:val="1"/>
         </w:numPr>
       </w:pPr>
-      <w:bookmarkStart w:id="30" w:name="_Toc450917905"/>
-      <w:bookmarkStart w:id="31" w:name="_Toc75418881"/>
+      <w:bookmarkStart w:id="29" w:name="_Toc450917905"/>
+      <w:bookmarkStart w:id="30" w:name="_Toc229569536"/>
       <w:proofErr w:type="spellStart"/>
       <w:r>
         <w:lastRenderedPageBreak/>
         <w:t>Risikoakzeptanzschwellen</w:t>
       </w:r>
+      <w:bookmarkEnd w:id="29"/>
       <w:bookmarkEnd w:id="30"/>
-      <w:bookmarkEnd w:id="31"/>
       <w:proofErr w:type="spellEnd"/>
     </w:p>
     <w:p>
@@ -4908,7 +4959,6 @@
           <w:color w:val="000000" w:themeColor="text1"/>
         </w:rPr>
       </w:pPr>
-      <w:proofErr w:type="gramStart"/>
       <w:r>
         <w:rPr>
           <w:color w:val="000000" w:themeColor="text1"/>
@@ -4919,13 +4969,20 @@
         <w:rPr>
           <w:color w:val="000000" w:themeColor="text1"/>
         </w:rPr>
-        <w:t>:</w:t>
-      </w:r>
-      <w:proofErr w:type="gramEnd"/>
+        <w:t xml:space="preserve">: </w:t>
+      </w:r>
+      <w:proofErr w:type="spellStart"/>
       <w:r>
         <w:rPr>
           <w:color w:val="000000" w:themeColor="text1"/>
         </w:rPr>
+        <w:t>Inakzeptables</w:t>
+      </w:r>
+      <w:proofErr w:type="spellEnd"/>
+      <w:r>
+        <w:rPr>
+          <w:color w:val="000000" w:themeColor="text1"/>
+        </w:rPr>
         <w:t xml:space="preserve"> </w:t>
       </w:r>
       <w:proofErr w:type="spellStart"/>
@@ -4933,42 +4990,14 @@
         <w:rPr>
           <w:color w:val="000000" w:themeColor="text1"/>
         </w:rPr>
-        <w:t>Inakzeptables</w:t>
+        <w:t>Risiko</w:t>
       </w:r>
       <w:proofErr w:type="spellEnd"/>
       <w:r>
         <w:rPr>
           <w:color w:val="000000" w:themeColor="text1"/>
         </w:rPr>
-        <w:t xml:space="preserve"> </w:t>
-      </w:r>
-      <w:proofErr w:type="spellStart"/>
-      <w:r>
-        <w:rPr>
-          <w:color w:val="000000" w:themeColor="text1"/>
-        </w:rPr>
-        <w:t>Risiko</w:t>
-      </w:r>
-      <w:proofErr w:type="spellEnd"/>
-      <w:r>
-        <w:rPr>
-          <w:color w:val="000000" w:themeColor="text1"/>
-        </w:rPr>
-        <w:t xml:space="preserve">, </w:t>
-      </w:r>
-      <w:proofErr w:type="spellStart"/>
-      <w:r>
-        <w:rPr>
-          <w:color w:val="000000" w:themeColor="text1"/>
-        </w:rPr>
-        <w:t>dem</w:t>
-      </w:r>
-      <w:proofErr w:type="spellEnd"/>
-      <w:r>
-        <w:rPr>
-          <w:color w:val="000000" w:themeColor="text1"/>
-        </w:rPr>
-        <w:t xml:space="preserve"> </w:t>
+        <w:t xml:space="preserve">, dem </w:t>
       </w:r>
       <w:proofErr w:type="spellStart"/>
       <w:r>
@@ -5038,21 +5067,7 @@
         <w:rPr>
           <w:color w:val="000000" w:themeColor="text1"/>
         </w:rPr>
-        <w:t xml:space="preserve">, </w:t>
-      </w:r>
-      <w:proofErr w:type="spellStart"/>
-      <w:r>
-        <w:rPr>
-          <w:color w:val="000000" w:themeColor="text1"/>
-        </w:rPr>
-        <w:t>dem</w:t>
-      </w:r>
-      <w:proofErr w:type="spellEnd"/>
-      <w:r>
-        <w:rPr>
-          <w:color w:val="000000" w:themeColor="text1"/>
-        </w:rPr>
-        <w:t xml:space="preserve"> </w:t>
+        <w:t xml:space="preserve">, dem </w:t>
       </w:r>
       <w:proofErr w:type="spellStart"/>
       <w:r>
@@ -5147,7 +5162,6 @@
         </w:rPr>
       </w:pPr>
       <w:proofErr w:type="spellStart"/>
-      <w:proofErr w:type="gramStart"/>
       <w:r>
         <w:rPr>
           <w:color w:val="000000" w:themeColor="text1"/>
@@ -5159,14 +5173,7 @@
         <w:rPr>
           <w:color w:val="000000" w:themeColor="text1"/>
         </w:rPr>
-        <w:t> :</w:t>
-      </w:r>
-      <w:proofErr w:type="gramEnd"/>
-      <w:r>
-        <w:rPr>
-          <w:color w:val="000000" w:themeColor="text1"/>
-        </w:rPr>
-        <w:t xml:space="preserve"> </w:t>
+        <w:t xml:space="preserve"> : </w:t>
       </w:r>
       <w:proofErr w:type="spellStart"/>
       <w:r>
@@ -5241,7 +5248,6 @@
     </w:p>
     <w:p>
       <w:pPr>
-        <w:jc w:val="center"/>
         <w:rPr>
           <w:lang w:val="fr-LU"/>
         </w:rPr>
@@ -5277,7 +5283,7 @@
           <w:lang w:val="fr-LU"/>
         </w:rPr>
       </w:pPr>
-      <w:bookmarkStart w:id="32" w:name="_Toc75418882"/>
+      <w:bookmarkStart w:id="31" w:name="_Toc229569537"/>
       <w:r>
         <w:t>Operative</w:t>
       </w:r>
@@ -5295,7 +5301,7 @@
       <w:r>
         <w:t>Risiken</w:t>
       </w:r>
-      <w:bookmarkEnd w:id="32"/>
+      <w:bookmarkEnd w:id="31"/>
       <w:proofErr w:type="spellEnd"/>
     </w:p>
     <w:p>
@@ -5306,20 +5312,15 @@
           <w:numId w:val="1"/>
         </w:numPr>
       </w:pPr>
-      <w:bookmarkStart w:id="33" w:name="_Toc75418883"/>
-      <w:proofErr w:type="spellStart"/>
-      <w:r>
-        <w:t>Skala</w:t>
-      </w:r>
-      <w:proofErr w:type="spellEnd"/>
-      <w:r>
-        <w:t xml:space="preserve"> </w:t>
+      <w:bookmarkStart w:id="32" w:name="_Toc229569538"/>
+      <w:r>
+        <w:t xml:space="preserve">Skala </w:t>
       </w:r>
       <w:proofErr w:type="spellStart"/>
       <w:r>
         <w:t>Auswirkungen</w:t>
       </w:r>
-      <w:bookmarkEnd w:id="33"/>
+      <w:bookmarkEnd w:id="32"/>
       <w:proofErr w:type="spellEnd"/>
       <w:r>
         <w:t xml:space="preserve"> </w:t>
@@ -5338,12 +5339,12 @@
           <w:numId w:val="1"/>
         </w:numPr>
       </w:pPr>
-      <w:bookmarkStart w:id="34" w:name="_Toc75418884"/>
+      <w:bookmarkStart w:id="33" w:name="_Toc229569539"/>
       <w:proofErr w:type="spellStart"/>
       <w:r>
         <w:t>Wahrscheinlichkeitsskala</w:t>
       </w:r>
-      <w:bookmarkEnd w:id="34"/>
+      <w:bookmarkEnd w:id="33"/>
       <w:proofErr w:type="spellEnd"/>
     </w:p>
     <w:p>
@@ -5359,18 +5360,15 @@
           <w:numId w:val="1"/>
         </w:numPr>
       </w:pPr>
-      <w:bookmarkStart w:id="35" w:name="_Toc75418885"/>
+      <w:bookmarkStart w:id="34" w:name="_Toc229569540"/>
       <w:proofErr w:type="spellStart"/>
       <w:r>
         <w:t>Risikoakzeptanzschwellen</w:t>
       </w:r>
-      <w:bookmarkEnd w:id="35"/>
+      <w:bookmarkEnd w:id="34"/>
       <w:proofErr w:type="spellEnd"/>
     </w:p>
     <w:p>
-      <w:pPr>
-        <w:jc w:val="center"/>
-      </w:pPr>
       <w:r>
         <w:t>${TABLE_OP_RISKS}</w:t>
       </w:r>
@@ -5383,30 +5381,22 @@
           <w:numId w:val="1"/>
         </w:numPr>
       </w:pPr>
-      <w:bookmarkStart w:id="36" w:name="_Toc450917906"/>
-      <w:bookmarkStart w:id="37" w:name="_Toc75418886"/>
+      <w:bookmarkStart w:id="35" w:name="_Toc450917906"/>
+      <w:bookmarkStart w:id="36" w:name="_Toc229569541"/>
       <w:proofErr w:type="spellStart"/>
       <w:r>
         <w:t>Bewertung</w:t>
       </w:r>
       <w:proofErr w:type="spellEnd"/>
       <w:r>
-        <w:t xml:space="preserve"> der </w:t>
-      </w:r>
-      <w:proofErr w:type="spellStart"/>
-      <w:r>
-        <w:t>Tendenzen</w:t>
-      </w:r>
-      <w:proofErr w:type="spellEnd"/>
-      <w:r>
-        <w:t xml:space="preserve"> und der </w:t>
+        <w:t xml:space="preserve"> der Tendenzen und der </w:t>
       </w:r>
       <w:proofErr w:type="spellStart"/>
       <w:r>
         <w:t>Bedrohungen</w:t>
       </w:r>
+      <w:bookmarkEnd w:id="35"/>
       <w:bookmarkEnd w:id="36"/>
-      <w:bookmarkEnd w:id="37"/>
       <w:proofErr w:type="spellEnd"/>
       <w:r>
         <w:t xml:space="preserve"> </w:t>
@@ -5512,9 +5502,185 @@
     </w:p>
     <w:p>
       <w:pPr>
+        <w:pStyle w:val="Heading2"/>
+        <w:numPr>
+          <w:ilvl w:val="1"/>
+          <w:numId w:val="1"/>
+        </w:numPr>
+        <w:spacing w:before="0"/>
+        <w:rPr>
+          <w:lang w:val="fr-LU"/>
+        </w:rPr>
+      </w:pPr>
+      <w:bookmarkStart w:id="37" w:name="_Toc229568903"/>
+      <w:bookmarkStart w:id="38" w:name="_Toc229569542"/>
+      <w:proofErr w:type="spellStart"/>
+      <w:r>
+        <w:lastRenderedPageBreak/>
+        <w:t>Auslöser</w:t>
+      </w:r>
+      <w:proofErr w:type="spellEnd"/>
+      <w:r>
+        <w:t xml:space="preserve"> für </w:t>
+      </w:r>
+      <w:proofErr w:type="spellStart"/>
+      <w:r>
+        <w:t>eine</w:t>
+      </w:r>
+      <w:proofErr w:type="spellEnd"/>
+      <w:r>
+        <w:t xml:space="preserve"> </w:t>
+      </w:r>
+      <w:proofErr w:type="spellStart"/>
+      <w:r>
+        <w:t>Neubewertung</w:t>
+      </w:r>
+      <w:bookmarkEnd w:id="37"/>
+      <w:bookmarkEnd w:id="38"/>
+      <w:proofErr w:type="spellEnd"/>
+    </w:p>
+    <w:p>
+      <w:pPr>
+        <w:rPr>
+          <w:lang w:val="en-LU"/>
+        </w:rPr>
+      </w:pPr>
+      <w:r>
+        <w:t xml:space="preserve">Die </w:t>
+      </w:r>
+      <w:proofErr w:type="spellStart"/>
+      <w:r>
+        <w:t>folgenden</w:t>
+      </w:r>
+      <w:proofErr w:type="spellEnd"/>
+      <w:r>
+        <w:t xml:space="preserve"> </w:t>
+      </w:r>
+      <w:proofErr w:type="spellStart"/>
+      <w:r>
+        <w:t>Ereignisse</w:t>
+      </w:r>
+      <w:proofErr w:type="spellEnd"/>
+      <w:r>
+        <w:t xml:space="preserve"> </w:t>
+      </w:r>
+      <w:proofErr w:type="spellStart"/>
+      <w:r>
+        <w:t>oder</w:t>
+      </w:r>
+      <w:proofErr w:type="spellEnd"/>
+      <w:r>
+        <w:t xml:space="preserve"> </w:t>
+      </w:r>
+      <w:proofErr w:type="spellStart"/>
+      <w:r>
+        <w:t>Bedingungen</w:t>
+      </w:r>
+      <w:proofErr w:type="spellEnd"/>
+      <w:r>
+        <w:t xml:space="preserve"> </w:t>
+      </w:r>
+      <w:proofErr w:type="spellStart"/>
+      <w:r>
+        <w:t>erfordern</w:t>
+      </w:r>
+      <w:proofErr w:type="spellEnd"/>
+      <w:r>
+        <w:t xml:space="preserve"> </w:t>
+      </w:r>
+      <w:proofErr w:type="spellStart"/>
+      <w:r>
+        <w:t>eine</w:t>
+      </w:r>
+      <w:proofErr w:type="spellEnd"/>
+      <w:r>
+        <w:t xml:space="preserve"> </w:t>
+      </w:r>
+      <w:proofErr w:type="spellStart"/>
+      <w:r>
+        <w:t>Neubewertung</w:t>
+      </w:r>
+      <w:proofErr w:type="spellEnd"/>
+      <w:r>
+        <w:t xml:space="preserve"> der </w:t>
+      </w:r>
+      <w:proofErr w:type="spellStart"/>
+      <w:r>
+        <w:t>Risikoanalyse</w:t>
+      </w:r>
+      <w:proofErr w:type="spellEnd"/>
+      <w:r>
+        <w:t xml:space="preserve">, um </w:t>
+      </w:r>
+      <w:proofErr w:type="spellStart"/>
+      <w:r>
+        <w:t>sicherzustellen</w:t>
+      </w:r>
+      <w:proofErr w:type="spellEnd"/>
+      <w:r>
+        <w:t xml:space="preserve">, </w:t>
+      </w:r>
+      <w:proofErr w:type="spellStart"/>
+      <w:r>
+        <w:t>dass</w:t>
+      </w:r>
+      <w:proofErr w:type="spellEnd"/>
+      <w:r>
+        <w:t xml:space="preserve"> </w:t>
+      </w:r>
+      <w:proofErr w:type="spellStart"/>
+      <w:r>
+        <w:t>sie</w:t>
+      </w:r>
+      <w:proofErr w:type="spellEnd"/>
+      <w:r>
+        <w:t xml:space="preserve"> relevant und auf dem </w:t>
+      </w:r>
+      <w:proofErr w:type="spellStart"/>
+      <w:r>
+        <w:t>neuesten</w:t>
+      </w:r>
+      <w:proofErr w:type="spellEnd"/>
+      <w:r>
+        <w:t xml:space="preserve"> Stand </w:t>
+      </w:r>
+      <w:proofErr w:type="spellStart"/>
+      <w:r>
+        <w:t>bleibt</w:t>
+      </w:r>
+      <w:proofErr w:type="spellEnd"/>
+      <w:r>
+        <w:rPr>
+          <w:lang w:val="en-LU"/>
+        </w:rPr>
+        <w:t>.</w:t>
+      </w:r>
+    </w:p>
+    <w:p>
+      <w:pPr>
+        <w:rPr>
+          <w:lang w:val="en-LU"/>
+        </w:rPr>
+      </w:pPr>
+      <w:r>
+        <w:t>${</w:t>
+      </w:r>
+      <w:r>
+        <w:rPr>
+          <w:lang w:val="en-LU"/>
+        </w:rPr>
+        <w:t>TABLE_REASSESSMENT_TRIGGERS</w:t>
+      </w:r>
+      <w:r>
+        <w:t>}</w:t>
+      </w:r>
+    </w:p>
+    <w:p/>
+    <w:p>
+      <w:pPr>
         <w:pStyle w:val="Heading1"/>
       </w:pPr>
-      <w:bookmarkStart w:id="38" w:name="_Toc75418887"/>
+      <w:bookmarkStart w:id="39" w:name="_Toc229569543"/>
       <w:proofErr w:type="spellStart"/>
       <w:r>
         <w:lastRenderedPageBreak/>
@@ -5528,7 +5694,7 @@
       <w:r>
         <w:t>Informationsbeschaffung</w:t>
       </w:r>
-      <w:bookmarkEnd w:id="38"/>
+      <w:bookmarkEnd w:id="39"/>
       <w:proofErr w:type="spellEnd"/>
     </w:p>
     <w:p>
@@ -5550,9 +5716,9 @@
       <w:pPr>
         <w:pStyle w:val="Heading1"/>
       </w:pPr>
-      <w:bookmarkStart w:id="39" w:name="_Toc450917916"/>
-      <w:bookmarkStart w:id="40" w:name="_Toc488826825"/>
-      <w:bookmarkStart w:id="41" w:name="_Toc75418888"/>
+      <w:bookmarkStart w:id="40" w:name="_Toc450917916"/>
+      <w:bookmarkStart w:id="41" w:name="_Toc488826825"/>
+      <w:bookmarkStart w:id="42" w:name="_Toc229569544"/>
       <w:proofErr w:type="spellStart"/>
       <w:r>
         <w:lastRenderedPageBreak/>
@@ -5568,16 +5734,11 @@
       </w:r>
       <w:proofErr w:type="spellEnd"/>
       <w:r>
-        <w:t xml:space="preserve"> der </w:t>
-      </w:r>
-      <w:proofErr w:type="spellStart"/>
-      <w:r>
-        <w:t>Tendenzen</w:t>
-      </w:r>
-      <w:bookmarkEnd w:id="39"/>
+        <w:t xml:space="preserve"> der Tendenzen</w:t>
+      </w:r>
       <w:bookmarkEnd w:id="40"/>
       <w:bookmarkEnd w:id="41"/>
-      <w:proofErr w:type="spellEnd"/>
+      <w:bookmarkEnd w:id="42"/>
     </w:p>
     <w:p>
       <w:r>
@@ -5593,9 +5754,9 @@
       <w:pPr>
         <w:pStyle w:val="Heading1"/>
       </w:pPr>
-      <w:bookmarkStart w:id="42" w:name="_Toc450917917"/>
-      <w:bookmarkStart w:id="43" w:name="_Toc488826826"/>
-      <w:bookmarkStart w:id="44" w:name="_Toc75418889"/>
+      <w:bookmarkStart w:id="43" w:name="_Toc450917917"/>
+      <w:bookmarkStart w:id="44" w:name="_Toc488826826"/>
+      <w:bookmarkStart w:id="45" w:name="_Toc229569545"/>
       <w:proofErr w:type="spellStart"/>
       <w:r>
         <w:lastRenderedPageBreak/>
@@ -5617,9 +5778,9 @@
       <w:r>
         <w:t>Bedrohungen</w:t>
       </w:r>
-      <w:bookmarkEnd w:id="42"/>
       <w:bookmarkEnd w:id="43"/>
       <w:bookmarkEnd w:id="44"/>
+      <w:bookmarkEnd w:id="45"/>
       <w:proofErr w:type="spellEnd"/>
     </w:p>
     <w:p>
@@ -5641,7 +5802,7 @@
 </file>
 
 <file path=word/endnotes.xml><?xml version="1.0" encoding="utf-8"?>
-<w:endnotes xmlns:wpc="http://schemas.microsoft.com/office/word/2010/wordprocessingCanvas" xmlns:cx="http://schemas.microsoft.com/office/drawing/2014/chartex" xmlns:mc="http://schemas.openxmlformats.org/markup-compatibility/2006" xmlns:o="urn:schemas-microsoft-com:office:office" xmlns:r="http://schemas.openxmlformats.org/officeDocument/2006/relationships" xmlns:m="http://schemas.openxmlformats.org/officeDocument/2006/math" xmlns:v="urn:schemas-microsoft-com:vml" xmlns:wp14="http://schemas.microsoft.com/office/word/2010/wordprocessingDrawing" xmlns:wp="http://schemas.openxmlformats.org/drawingml/2006/wordprocessingDrawing" xmlns:w10="urn:schemas-microsoft-com:office:word" xmlns:w="http://schemas.openxmlformats.org/wordprocessingml/2006/main" xmlns:w14="http://schemas.microsoft.com/office/word/2010/wordml" xmlns:w15="http://schemas.microsoft.com/office/word/2012/wordml" xmlns:w16se="http://schemas.microsoft.com/office/word/2015/wordml/symex" xmlns:wpg="http://schemas.microsoft.com/office/word/2010/wordprocessingGroup" xmlns:wpi="http://schemas.microsoft.com/office/word/2010/wordprocessingInk" xmlns:wne="http://schemas.microsoft.com/office/word/2006/wordml" xmlns:wps="http://schemas.microsoft.com/office/word/2010/wordprocessingShape" mc:Ignorable="w14 w15 w16se wp14">
+<w:endnotes xmlns:wpc="http://schemas.microsoft.com/office/word/2010/wordprocessingCanvas" xmlns:cx="http://schemas.microsoft.com/office/drawing/2014/chartex" xmlns:cx1="http://schemas.microsoft.com/office/drawing/2015/9/8/chartex" xmlns:cx2="http://schemas.microsoft.com/office/drawing/2015/10/21/chartex" xmlns:cx3="http://schemas.microsoft.com/office/drawing/2016/5/9/chartex" xmlns:cx4="http://schemas.microsoft.com/office/drawing/2016/5/10/chartex" xmlns:cx5="http://schemas.microsoft.com/office/drawing/2016/5/11/chartex" xmlns:cx6="http://schemas.microsoft.com/office/drawing/2016/5/12/chartex" xmlns:cx7="http://schemas.microsoft.com/office/drawing/2016/5/13/chartex" xmlns:cx8="http://schemas.microsoft.com/office/drawing/2016/5/14/chartex" xmlns:mc="http://schemas.openxmlformats.org/markup-compatibility/2006" xmlns:aink="http://schemas.microsoft.com/office/drawing/2016/ink" xmlns:am3d="http://schemas.microsoft.com/office/drawing/2017/model3d" xmlns:o="urn:schemas-microsoft-com:office:office" xmlns:oel="http://schemas.microsoft.com/office/2019/extlst" xmlns:r="http://schemas.openxmlformats.org/officeDocument/2006/relationships" xmlns:m="http://schemas.openxmlformats.org/officeDocument/2006/math" xmlns:v="urn:schemas-microsoft-com:vml" xmlns:wp14="http://schemas.microsoft.com/office/word/2010/wordprocessingDrawing" xmlns:wp="http://schemas.openxmlformats.org/drawingml/2006/wordprocessingDrawing" xmlns:w10="urn:schemas-microsoft-com:office:word" xmlns:w="http://schemas.openxmlformats.org/wordprocessingml/2006/main" xmlns:w14="http://schemas.microsoft.com/office/word/2010/wordml" xmlns:w15="http://schemas.microsoft.com/office/word/2012/wordml" xmlns:w16cex="http://schemas.microsoft.com/office/word/2018/wordml/cex" xmlns:w16cid="http://schemas.microsoft.com/office/word/2016/wordml/cid" xmlns:w16="http://schemas.microsoft.com/office/word/2018/wordml" xmlns:w16du="http://schemas.microsoft.com/office/word/2023/wordml/word16du" xmlns:w16sdtdh="http://schemas.microsoft.com/office/word/2020/wordml/sdtdatahash" xmlns:w16se="http://schemas.microsoft.com/office/word/2015/wordml/symex" xmlns:wpg="http://schemas.microsoft.com/office/word/2010/wordprocessingGroup" xmlns:wpi="http://schemas.microsoft.com/office/word/2010/wordprocessingInk" xmlns:wne="http://schemas.microsoft.com/office/word/2006/wordml" xmlns:wps="http://schemas.microsoft.com/office/word/2010/wordprocessingShape" mc:Ignorable="w14 w15 w16se w16cid w16 w16cex w16sdtdh w16du wp14">
   <w:endnote w:type="separator" w:id="-1">
     <w:p>
       <w:r>
@@ -5660,7 +5821,7 @@
 </file>
 
 <file path=word/footer1.xml><?xml version="1.0" encoding="utf-8"?>
-<w:ftr xmlns:wpc="http://schemas.microsoft.com/office/word/2010/wordprocessingCanvas" xmlns:cx="http://schemas.microsoft.com/office/drawing/2014/chartex" xmlns:mc="http://schemas.openxmlformats.org/markup-compatibility/2006" xmlns:o="urn:schemas-microsoft-com:office:office" xmlns:r="http://schemas.openxmlformats.org/officeDocument/2006/relationships" xmlns:m="http://schemas.openxmlformats.org/officeDocument/2006/math" xmlns:v="urn:schemas-microsoft-com:vml" xmlns:wp14="http://schemas.microsoft.com/office/word/2010/wordprocessingDrawing" xmlns:wp="http://schemas.openxmlformats.org/drawingml/2006/wordprocessingDrawing" xmlns:w10="urn:schemas-microsoft-com:office:word" xmlns:w="http://schemas.openxmlformats.org/wordprocessingml/2006/main" xmlns:w14="http://schemas.microsoft.com/office/word/2010/wordml" xmlns:w15="http://schemas.microsoft.com/office/word/2012/wordml" xmlns:w16se="http://schemas.microsoft.com/office/word/2015/wordml/symex" xmlns:wpg="http://schemas.microsoft.com/office/word/2010/wordprocessingGroup" xmlns:wpi="http://schemas.microsoft.com/office/word/2010/wordprocessingInk" xmlns:wne="http://schemas.microsoft.com/office/word/2006/wordml" xmlns:wps="http://schemas.microsoft.com/office/word/2010/wordprocessingShape" mc:Ignorable="w14 w15 w16se wp14">
+<w:ftr xmlns:wpc="http://schemas.microsoft.com/office/word/2010/wordprocessingCanvas" xmlns:cx="http://schemas.microsoft.com/office/drawing/2014/chartex" xmlns:cx1="http://schemas.microsoft.com/office/drawing/2015/9/8/chartex" xmlns:cx2="http://schemas.microsoft.com/office/drawing/2015/10/21/chartex" xmlns:cx3="http://schemas.microsoft.com/office/drawing/2016/5/9/chartex" xmlns:cx4="http://schemas.microsoft.com/office/drawing/2016/5/10/chartex" xmlns:cx5="http://schemas.microsoft.com/office/drawing/2016/5/11/chartex" xmlns:cx6="http://schemas.microsoft.com/office/drawing/2016/5/12/chartex" xmlns:cx7="http://schemas.microsoft.com/office/drawing/2016/5/13/chartex" xmlns:cx8="http://schemas.microsoft.com/office/drawing/2016/5/14/chartex" xmlns:mc="http://schemas.openxmlformats.org/markup-compatibility/2006" xmlns:aink="http://schemas.microsoft.com/office/drawing/2016/ink" xmlns:am3d="http://schemas.microsoft.com/office/drawing/2017/model3d" xmlns:o="urn:schemas-microsoft-com:office:office" xmlns:oel="http://schemas.microsoft.com/office/2019/extlst" xmlns:r="http://schemas.openxmlformats.org/officeDocument/2006/relationships" xmlns:m="http://schemas.openxmlformats.org/officeDocument/2006/math" xmlns:v="urn:schemas-microsoft-com:vml" xmlns:wp14="http://schemas.microsoft.com/office/word/2010/wordprocessingDrawing" xmlns:wp="http://schemas.openxmlformats.org/drawingml/2006/wordprocessingDrawing" xmlns:w10="urn:schemas-microsoft-com:office:word" xmlns:w="http://schemas.openxmlformats.org/wordprocessingml/2006/main" xmlns:w14="http://schemas.microsoft.com/office/word/2010/wordml" xmlns:w15="http://schemas.microsoft.com/office/word/2012/wordml" xmlns:w16cex="http://schemas.microsoft.com/office/word/2018/wordml/cex" xmlns:w16cid="http://schemas.microsoft.com/office/word/2016/wordml/cid" xmlns:w16="http://schemas.microsoft.com/office/word/2018/wordml" xmlns:w16du="http://schemas.microsoft.com/office/word/2023/wordml/word16du" xmlns:w16sdtdh="http://schemas.microsoft.com/office/word/2020/wordml/sdtdatahash" xmlns:w16se="http://schemas.microsoft.com/office/word/2015/wordml/symex" xmlns:wpg="http://schemas.microsoft.com/office/word/2010/wordprocessingGroup" xmlns:wpi="http://schemas.microsoft.com/office/word/2010/wordprocessingInk" xmlns:wne="http://schemas.microsoft.com/office/word/2006/wordml" xmlns:wps="http://schemas.microsoft.com/office/word/2010/wordprocessingShape" mc:Ignorable="w14 w15 w16se w16cid w16 w16cex w16sdtdh w16du wp14">
   <w:p>
     <w:pPr>
       <w:pStyle w:val="smile-footer"/>
@@ -5939,7 +6100,7 @@
 </file>
 
 <file path=word/footnotes.xml><?xml version="1.0" encoding="utf-8"?>
-<w:footnotes xmlns:wpc="http://schemas.microsoft.com/office/word/2010/wordprocessingCanvas" xmlns:cx="http://schemas.microsoft.com/office/drawing/2014/chartex" xmlns:mc="http://schemas.openxmlformats.org/markup-compatibility/2006" xmlns:o="urn:schemas-microsoft-com:office:office" xmlns:r="http://schemas.openxmlformats.org/officeDocument/2006/relationships" xmlns:m="http://schemas.openxmlformats.org/officeDocument/2006/math" xmlns:v="urn:schemas-microsoft-com:vml" xmlns:wp14="http://schemas.microsoft.com/office/word/2010/wordprocessingDrawing" xmlns:wp="http://schemas.openxmlformats.org/drawingml/2006/wordprocessingDrawing" xmlns:w10="urn:schemas-microsoft-com:office:word" xmlns:w="http://schemas.openxmlformats.org/wordprocessingml/2006/main" xmlns:w14="http://schemas.microsoft.com/office/word/2010/wordml" xmlns:w15="http://schemas.microsoft.com/office/word/2012/wordml" xmlns:w16se="http://schemas.microsoft.com/office/word/2015/wordml/symex" xmlns:wpg="http://schemas.microsoft.com/office/word/2010/wordprocessingGroup" xmlns:wpi="http://schemas.microsoft.com/office/word/2010/wordprocessingInk" xmlns:wne="http://schemas.microsoft.com/office/word/2006/wordml" xmlns:wps="http://schemas.microsoft.com/office/word/2010/wordprocessingShape" mc:Ignorable="w14 w15 w16se wp14">
+<w:footnotes xmlns:wpc="http://schemas.microsoft.com/office/word/2010/wordprocessingCanvas" xmlns:cx="http://schemas.microsoft.com/office/drawing/2014/chartex" xmlns:cx1="http://schemas.microsoft.com/office/drawing/2015/9/8/chartex" xmlns:cx2="http://schemas.microsoft.com/office/drawing/2015/10/21/chartex" xmlns:cx3="http://schemas.microsoft.com/office/drawing/2016/5/9/chartex" xmlns:cx4="http://schemas.microsoft.com/office/drawing/2016/5/10/chartex" xmlns:cx5="http://schemas.microsoft.com/office/drawing/2016/5/11/chartex" xmlns:cx6="http://schemas.microsoft.com/office/drawing/2016/5/12/chartex" xmlns:cx7="http://schemas.microsoft.com/office/drawing/2016/5/13/chartex" xmlns:cx8="http://schemas.microsoft.com/office/drawing/2016/5/14/chartex" xmlns:mc="http://schemas.openxmlformats.org/markup-compatibility/2006" xmlns:aink="http://schemas.microsoft.com/office/drawing/2016/ink" xmlns:am3d="http://schemas.microsoft.com/office/drawing/2017/model3d" xmlns:o="urn:schemas-microsoft-com:office:office" xmlns:oel="http://schemas.microsoft.com/office/2019/extlst" xmlns:r="http://schemas.openxmlformats.org/officeDocument/2006/relationships" xmlns:m="http://schemas.openxmlformats.org/officeDocument/2006/math" xmlns:v="urn:schemas-microsoft-com:vml" xmlns:wp14="http://schemas.microsoft.com/office/word/2010/wordprocessingDrawing" xmlns:wp="http://schemas.openxmlformats.org/drawingml/2006/wordprocessingDrawing" xmlns:w10="urn:schemas-microsoft-com:office:word" xmlns:w="http://schemas.openxmlformats.org/wordprocessingml/2006/main" xmlns:w14="http://schemas.microsoft.com/office/word/2010/wordml" xmlns:w15="http://schemas.microsoft.com/office/word/2012/wordml" xmlns:w16cex="http://schemas.microsoft.com/office/word/2018/wordml/cex" xmlns:w16cid="http://schemas.microsoft.com/office/word/2016/wordml/cid" xmlns:w16="http://schemas.microsoft.com/office/word/2018/wordml" xmlns:w16du="http://schemas.microsoft.com/office/word/2023/wordml/word16du" xmlns:w16sdtdh="http://schemas.microsoft.com/office/word/2020/wordml/sdtdatahash" xmlns:w16se="http://schemas.microsoft.com/office/word/2015/wordml/symex" xmlns:wpg="http://schemas.microsoft.com/office/word/2010/wordprocessingGroup" xmlns:wpi="http://schemas.microsoft.com/office/word/2010/wordprocessingInk" xmlns:wne="http://schemas.microsoft.com/office/word/2006/wordml" xmlns:wps="http://schemas.microsoft.com/office/word/2010/wordprocessingShape" mc:Ignorable="w14 w15 w16se w16cid w16 w16cex w16sdtdh w16du wp14">
   <w:footnote w:type="separator" w:id="-1">
     <w:p>
       <w:r>
@@ -5958,7 +6119,7 @@
 </file>
 
 <file path=word/header1.xml><?xml version="1.0" encoding="utf-8"?>
-<w:hdr xmlns:wpc="http://schemas.microsoft.com/office/word/2010/wordprocessingCanvas" xmlns:cx="http://schemas.microsoft.com/office/drawing/2014/chartex" xmlns:mc="http://schemas.openxmlformats.org/markup-compatibility/2006" xmlns:o="urn:schemas-microsoft-com:office:office" xmlns:r="http://schemas.openxmlformats.org/officeDocument/2006/relationships" xmlns:m="http://schemas.openxmlformats.org/officeDocument/2006/math" xmlns:v="urn:schemas-microsoft-com:vml" xmlns:wp14="http://schemas.microsoft.com/office/word/2010/wordprocessingDrawing" xmlns:wp="http://schemas.openxmlformats.org/drawingml/2006/wordprocessingDrawing" xmlns:w10="urn:schemas-microsoft-com:office:word" xmlns:w="http://schemas.openxmlformats.org/wordprocessingml/2006/main" xmlns:w14="http://schemas.microsoft.com/office/word/2010/wordml" xmlns:w15="http://schemas.microsoft.com/office/word/2012/wordml" xmlns:w16se="http://schemas.microsoft.com/office/word/2015/wordml/symex" xmlns:wpg="http://schemas.microsoft.com/office/word/2010/wordprocessingGroup" xmlns:wpi="http://schemas.microsoft.com/office/word/2010/wordprocessingInk" xmlns:wne="http://schemas.microsoft.com/office/word/2006/wordml" xmlns:wps="http://schemas.microsoft.com/office/word/2010/wordprocessingShape" mc:Ignorable="w14 w15 w16se wp14">
+<w:hdr xmlns:wpc="http://schemas.microsoft.com/office/word/2010/wordprocessingCanvas" xmlns:cx="http://schemas.microsoft.com/office/drawing/2014/chartex" xmlns:cx1="http://schemas.microsoft.com/office/drawing/2015/9/8/chartex" xmlns:cx2="http://schemas.microsoft.com/office/drawing/2015/10/21/chartex" xmlns:cx3="http://schemas.microsoft.com/office/drawing/2016/5/9/chartex" xmlns:cx4="http://schemas.microsoft.com/office/drawing/2016/5/10/chartex" xmlns:cx5="http://schemas.microsoft.com/office/drawing/2016/5/11/chartex" xmlns:cx6="http://schemas.microsoft.com/office/drawing/2016/5/12/chartex" xmlns:cx7="http://schemas.microsoft.com/office/drawing/2016/5/13/chartex" xmlns:cx8="http://schemas.microsoft.com/office/drawing/2016/5/14/chartex" xmlns:mc="http://schemas.openxmlformats.org/markup-compatibility/2006" xmlns:aink="http://schemas.microsoft.com/office/drawing/2016/ink" xmlns:am3d="http://schemas.microsoft.com/office/drawing/2017/model3d" xmlns:o="urn:schemas-microsoft-com:office:office" xmlns:oel="http://schemas.microsoft.com/office/2019/extlst" xmlns:r="http://schemas.openxmlformats.org/officeDocument/2006/relationships" xmlns:m="http://schemas.openxmlformats.org/officeDocument/2006/math" xmlns:v="urn:schemas-microsoft-com:vml" xmlns:wp14="http://schemas.microsoft.com/office/word/2010/wordprocessingDrawing" xmlns:wp="http://schemas.openxmlformats.org/drawingml/2006/wordprocessingDrawing" xmlns:w10="urn:schemas-microsoft-com:office:word" xmlns:w="http://schemas.openxmlformats.org/wordprocessingml/2006/main" xmlns:w14="http://schemas.microsoft.com/office/word/2010/wordml" xmlns:w15="http://schemas.microsoft.com/office/word/2012/wordml" xmlns:w16cex="http://schemas.microsoft.com/office/word/2018/wordml/cex" xmlns:w16cid="http://schemas.microsoft.com/office/word/2016/wordml/cid" xmlns:w16="http://schemas.microsoft.com/office/word/2018/wordml" xmlns:w16du="http://schemas.microsoft.com/office/word/2023/wordml/word16du" xmlns:w16sdtdh="http://schemas.microsoft.com/office/word/2020/wordml/sdtdatahash" xmlns:w16se="http://schemas.microsoft.com/office/word/2015/wordml/symex" xmlns:wpg="http://schemas.microsoft.com/office/word/2010/wordprocessingGroup" xmlns:wpi="http://schemas.microsoft.com/office/word/2010/wordprocessingInk" xmlns:wne="http://schemas.microsoft.com/office/word/2006/wordml" xmlns:wps="http://schemas.microsoft.com/office/word/2010/wordprocessingShape" mc:Ignorable="w14 w15 w16se w16cid w16 w16cex w16sdtdh w16du wp14">
   <w:tbl>
     <w:tblPr>
       <w:tblW w:w="9810" w:type="dxa"/>
@@ -6492,7 +6653,7 @@
 </file>
 
 <file path=word/numbering.xml><?xml version="1.0" encoding="utf-8"?>
-<w:numbering xmlns:wpc="http://schemas.microsoft.com/office/word/2010/wordprocessingCanvas" xmlns:cx="http://schemas.microsoft.com/office/drawing/2014/chartex" xmlns:mc="http://schemas.openxmlformats.org/markup-compatibility/2006" xmlns:o="urn:schemas-microsoft-com:office:office" xmlns:r="http://schemas.openxmlformats.org/officeDocument/2006/relationships" xmlns:m="http://schemas.openxmlformats.org/officeDocument/2006/math" xmlns:v="urn:schemas-microsoft-com:vml" xmlns:wp14="http://schemas.microsoft.com/office/word/2010/wordprocessingDrawing" xmlns:wp="http://schemas.openxmlformats.org/drawingml/2006/wordprocessingDrawing" xmlns:w10="urn:schemas-microsoft-com:office:word" xmlns:w="http://schemas.openxmlformats.org/wordprocessingml/2006/main" xmlns:w14="http://schemas.microsoft.com/office/word/2010/wordml" xmlns:w15="http://schemas.microsoft.com/office/word/2012/wordml" xmlns:w16se="http://schemas.microsoft.com/office/word/2015/wordml/symex" xmlns:wpg="http://schemas.microsoft.com/office/word/2010/wordprocessingGroup" xmlns:wpi="http://schemas.microsoft.com/office/word/2010/wordprocessingInk" xmlns:wne="http://schemas.microsoft.com/office/word/2006/wordml" xmlns:wps="http://schemas.microsoft.com/office/word/2010/wordprocessingShape" mc:Ignorable="w14 w15 w16se wp14">
+<w:numbering xmlns:wpc="http://schemas.microsoft.com/office/word/2010/wordprocessingCanvas" xmlns:cx="http://schemas.microsoft.com/office/drawing/2014/chartex" xmlns:cx1="http://schemas.microsoft.com/office/drawing/2015/9/8/chartex" xmlns:cx2="http://schemas.microsoft.com/office/drawing/2015/10/21/chartex" xmlns:cx3="http://schemas.microsoft.com/office/drawing/2016/5/9/chartex" xmlns:cx4="http://schemas.microsoft.com/office/drawing/2016/5/10/chartex" xmlns:cx5="http://schemas.microsoft.com/office/drawing/2016/5/11/chartex" xmlns:cx6="http://schemas.microsoft.com/office/drawing/2016/5/12/chartex" xmlns:cx7="http://schemas.microsoft.com/office/drawing/2016/5/13/chartex" xmlns:cx8="http://schemas.microsoft.com/office/drawing/2016/5/14/chartex" xmlns:mc="http://schemas.openxmlformats.org/markup-compatibility/2006" xmlns:aink="http://schemas.microsoft.com/office/drawing/2016/ink" xmlns:am3d="http://schemas.microsoft.com/office/drawing/2017/model3d" xmlns:o="urn:schemas-microsoft-com:office:office" xmlns:oel="http://schemas.microsoft.com/office/2019/extlst" xmlns:r="http://schemas.openxmlformats.org/officeDocument/2006/relationships" xmlns:m="http://schemas.openxmlformats.org/officeDocument/2006/math" xmlns:v="urn:schemas-microsoft-com:vml" xmlns:wp14="http://schemas.microsoft.com/office/word/2010/wordprocessingDrawing" xmlns:wp="http://schemas.openxmlformats.org/drawingml/2006/wordprocessingDrawing" xmlns:w10="urn:schemas-microsoft-com:office:word" xmlns:w="http://schemas.openxmlformats.org/wordprocessingml/2006/main" xmlns:w14="http://schemas.microsoft.com/office/word/2010/wordml" xmlns:w15="http://schemas.microsoft.com/office/word/2012/wordml" xmlns:w16cex="http://schemas.microsoft.com/office/word/2018/wordml/cex" xmlns:w16cid="http://schemas.microsoft.com/office/word/2016/wordml/cid" xmlns:w16="http://schemas.microsoft.com/office/word/2018/wordml" xmlns:w16du="http://schemas.microsoft.com/office/word/2023/wordml/word16du" xmlns:w16sdtdh="http://schemas.microsoft.com/office/word/2020/wordml/sdtdatahash" xmlns:w16se="http://schemas.microsoft.com/office/word/2015/wordml/symex" xmlns:wpg="http://schemas.microsoft.com/office/word/2010/wordprocessingGroup" xmlns:wpi="http://schemas.microsoft.com/office/word/2010/wordprocessingInk" xmlns:wne="http://schemas.microsoft.com/office/word/2006/wordml" xmlns:wps="http://schemas.microsoft.com/office/word/2010/wordprocessingShape" mc:Ignorable="w14 w15 w16se w16cid w16 w16cex w16sdtdh w16du wp14">
   <w:abstractNum w:abstractNumId="0" w15:restartNumberingAfterBreak="0">
     <w:nsid w:val="02727D86"/>
     <w:multiLevelType w:val="multilevel"/>
@@ -7912,40 +8073,40 @@
       </w:pPr>
     </w:lvl>
   </w:abstractNum>
-  <w:num w:numId="1">
+  <w:num w:numId="1" w16cid:durableId="1913927740">
     <w:abstractNumId w:val="3"/>
   </w:num>
-  <w:num w:numId="2">
+  <w:num w:numId="2" w16cid:durableId="1907493792">
     <w:abstractNumId w:val="8"/>
   </w:num>
-  <w:num w:numId="3">
+  <w:num w:numId="3" w16cid:durableId="847600487">
     <w:abstractNumId w:val="9"/>
   </w:num>
-  <w:num w:numId="4">
+  <w:num w:numId="4" w16cid:durableId="1486624318">
     <w:abstractNumId w:val="7"/>
   </w:num>
-  <w:num w:numId="5">
+  <w:num w:numId="5" w16cid:durableId="387723448">
     <w:abstractNumId w:val="6"/>
   </w:num>
-  <w:num w:numId="6">
+  <w:num w:numId="6" w16cid:durableId="687172626">
     <w:abstractNumId w:val="10"/>
   </w:num>
-  <w:num w:numId="7">
+  <w:num w:numId="7" w16cid:durableId="1201745060">
     <w:abstractNumId w:val="2"/>
   </w:num>
-  <w:num w:numId="8">
+  <w:num w:numId="8" w16cid:durableId="1581983044">
     <w:abstractNumId w:val="3"/>
   </w:num>
-  <w:num w:numId="9">
+  <w:num w:numId="9" w16cid:durableId="1622489841">
     <w:abstractNumId w:val="5"/>
   </w:num>
-  <w:num w:numId="10">
+  <w:num w:numId="10" w16cid:durableId="984509602">
     <w:abstractNumId w:val="4"/>
   </w:num>
-  <w:num w:numId="11">
+  <w:num w:numId="11" w16cid:durableId="1233001911">
     <w:abstractNumId w:val="1"/>
   </w:num>
-  <w:num w:numId="12">
+  <w:num w:numId="12" w16cid:durableId="862666398">
     <w:abstractNumId w:val="0"/>
   </w:num>
   <w:numIdMacAtCleanup w:val="9"/>
@@ -7953,7 +8114,7 @@
 </file>
 
 <file path=word/styles.xml><?xml version="1.0" encoding="utf-8"?>
-<w:styles xmlns:mc="http://schemas.openxmlformats.org/markup-compatibility/2006" xmlns:r="http://schemas.openxmlformats.org/officeDocument/2006/relationships" xmlns:w="http://schemas.openxmlformats.org/wordprocessingml/2006/main" xmlns:w14="http://schemas.microsoft.com/office/word/2010/wordml" xmlns:w15="http://schemas.microsoft.com/office/word/2012/wordml" xmlns:w16se="http://schemas.microsoft.com/office/word/2015/wordml/symex" mc:Ignorable="w14 w15 w16se">
+<w:styles xmlns:mc="http://schemas.openxmlformats.org/markup-compatibility/2006" xmlns:r="http://schemas.openxmlformats.org/officeDocument/2006/relationships" xmlns:w="http://schemas.openxmlformats.org/wordprocessingml/2006/main" xmlns:w14="http://schemas.microsoft.com/office/word/2010/wordml" xmlns:w15="http://schemas.microsoft.com/office/word/2012/wordml" xmlns:w16cex="http://schemas.microsoft.com/office/word/2018/wordml/cex" xmlns:w16cid="http://schemas.microsoft.com/office/word/2016/wordml/cid" xmlns:w16="http://schemas.microsoft.com/office/word/2018/wordml" xmlns:w16du="http://schemas.microsoft.com/office/word/2023/wordml/word16du" xmlns:w16sdtdh="http://schemas.microsoft.com/office/word/2020/wordml/sdtdatahash" xmlns:w16se="http://schemas.microsoft.com/office/word/2015/wordml/symex" mc:Ignorable="w14 w15 w16se w16cid w16 w16cex w16sdtdh w16du">
   <w:docDefaults>
     <w:rPrDefault>
       <w:rPr>
@@ -7969,7 +8130,7 @@
       </w:pPr>
     </w:pPrDefault>
   </w:docDefaults>
-  <w:latentStyles w:defLockedState="0" w:defUIPriority="99" w:defSemiHidden="0" w:defUnhideWhenUsed="0" w:defQFormat="0" w:count="371">
+  <w:latentStyles w:defLockedState="0" w:defUIPriority="99" w:defSemiHidden="0" w:defUnhideWhenUsed="0" w:defQFormat="0" w:count="376">
     <w:lsdException w:name="Normal" w:uiPriority="0" w:qFormat="1"/>
     <w:lsdException w:name="heading 1" w:uiPriority="9" w:qFormat="1"/>
     <w:lsdException w:name="heading 2" w:semiHidden="1" w:uiPriority="0" w:unhideWhenUsed="1" w:qFormat="1"/>
@@ -8332,6 +8493,11 @@
     <w:lsdException w:name="List Table 5 Dark Accent 6" w:uiPriority="50"/>
     <w:lsdException w:name="List Table 6 Colorful Accent 6" w:uiPriority="51"/>
     <w:lsdException w:name="List Table 7 Colorful Accent 6" w:uiPriority="52"/>
+    <w:lsdException w:name="Mention" w:semiHidden="1" w:unhideWhenUsed="1"/>
+    <w:lsdException w:name="Smart Hyperlink" w:semiHidden="1" w:unhideWhenUsed="1"/>
+    <w:lsdException w:name="Hashtag" w:semiHidden="1" w:unhideWhenUsed="1"/>
+    <w:lsdException w:name="Unresolved Mention" w:semiHidden="1" w:unhideWhenUsed="1"/>
+    <w:lsdException w:name="Smart Link" w:semiHidden="1" w:unhideWhenUsed="1"/>
   </w:latentStyles>
   <w:style w:type="paragraph" w:default="1" w:styleId="Normal">
     <w:name w:val="Normal"/>

</xml_diff>